<commit_message>
Revised Programs and notes.
</commit_message>
<xml_diff>
--- a/NOTES/1. AWS.docx
+++ b/NOTES/1. AWS.docx
@@ -5,18 +5,15 @@
     <w:p>
       <w:pPr>
         <w:jc w:val="both"/>
-      </w:pPr>
-    </w:p>
-    <w:p>
-      <w:pPr>
-        <w:jc w:val="both"/>
-        <w:rPr>
-          <w:b/>
-          <w:bCs/>
-        </w:rPr>
-      </w:pPr>
-      <w:r>
-        <w:rPr>
+        <w:rPr>
+          <w:rFonts w:ascii="Times New Roman" w:hAnsi="Times New Roman" w:cs="Times New Roman"/>
+          <w:b/>
+          <w:bCs/>
+        </w:rPr>
+      </w:pPr>
+      <w:r>
+        <w:rPr>
+          <w:rFonts w:ascii="Times New Roman" w:hAnsi="Times New Roman" w:cs="Times New Roman"/>
           <w:b/>
           <w:bCs/>
           <w:highlight w:val="yellow"/>
@@ -25,6 +22,7 @@
       </w:r>
       <w:r>
         <w:rPr>
+          <w:rFonts w:ascii="Times New Roman" w:hAnsi="Times New Roman" w:cs="Times New Roman"/>
           <w:b/>
           <w:bCs/>
           <w:highlight w:val="yellow"/>
@@ -33,6 +31,7 @@
       </w:r>
       <w:r>
         <w:rPr>
+          <w:rFonts w:ascii="Times New Roman" w:hAnsi="Times New Roman" w:cs="Times New Roman"/>
           <w:b/>
           <w:bCs/>
           <w:highlight w:val="yellow"/>
@@ -43,32 +42,82 @@
     <w:p>
       <w:pPr>
         <w:jc w:val="both"/>
-      </w:pPr>
-      <w:r>
+        <w:rPr>
+          <w:rFonts w:ascii="Times New Roman" w:hAnsi="Times New Roman" w:cs="Times New Roman"/>
+        </w:rPr>
+      </w:pPr>
+      <w:r>
+        <w:rPr>
+          <w:rFonts w:ascii="Times New Roman" w:hAnsi="Times New Roman" w:cs="Times New Roman"/>
+          <w:b/>
+          <w:bCs/>
+        </w:rPr>
+        <w:t>Source:</w:t>
+      </w:r>
+      <w:r>
+        <w:rPr>
+          <w:rFonts w:ascii="Times New Roman" w:hAnsi="Times New Roman" w:cs="Times New Roman"/>
+        </w:rPr>
+        <w:t xml:space="preserve"> </w:t>
+      </w:r>
+    </w:p>
+    <w:p>
+      <w:pPr>
+        <w:jc w:val="both"/>
+        <w:rPr>
+          <w:rFonts w:ascii="Times New Roman" w:hAnsi="Times New Roman" w:cs="Times New Roman"/>
+        </w:rPr>
+      </w:pPr>
+      <w:r>
+        <w:rPr>
+          <w:rFonts w:ascii="Times New Roman" w:hAnsi="Times New Roman" w:cs="Times New Roman"/>
+        </w:rPr>
         <w:t>https://www.youtube.com/watch?v=xkXZGvuerRU</w:t>
       </w:r>
     </w:p>
     <w:p>
       <w:pPr>
         <w:jc w:val="both"/>
-      </w:pPr>
-      <w:r>
+        <w:rPr>
+          <w:rFonts w:ascii="Times New Roman" w:hAnsi="Times New Roman" w:cs="Times New Roman"/>
+        </w:rPr>
+      </w:pPr>
+      <w:r>
+        <w:rPr>
+          <w:rFonts w:ascii="Times New Roman" w:hAnsi="Times New Roman" w:cs="Times New Roman"/>
+        </w:rPr>
         <w:t>EC2 (Elastic Compute Cloud) is a service that provides resizable virtual servers (called instances) in the cloud.</w:t>
       </w:r>
-    </w:p>
-    <w:p>
-      <w:pPr>
-        <w:jc w:val="both"/>
-      </w:pPr>
-      <w:r>
+      <w:r>
+        <w:rPr>
+          <w:rFonts w:ascii="Times New Roman" w:hAnsi="Times New Roman" w:cs="Times New Roman"/>
+        </w:rPr>
+        <w:t xml:space="preserve"> </w:t>
+      </w:r>
+      <w:r>
+        <w:rPr>
+          <w:rFonts w:ascii="Times New Roman" w:hAnsi="Times New Roman" w:cs="Times New Roman"/>
+        </w:rPr>
         <w:t>These servers run on AWS infrastructure, and you can launch, stop, scale, and terminate them anytime.</w:t>
       </w:r>
-    </w:p>
-    <w:p>
-      <w:pPr>
-        <w:jc w:val="both"/>
-      </w:pPr>
-      <w:r>
+      <w:r>
+        <w:rPr>
+          <w:rFonts w:ascii="Times New Roman" w:hAnsi="Times New Roman" w:cs="Times New Roman"/>
+        </w:rPr>
+        <w:t xml:space="preserve"> </w:t>
+      </w:r>
+    </w:p>
+    <w:p>
+      <w:pPr>
+        <w:jc w:val="both"/>
+        <w:rPr>
+          <w:rFonts w:ascii="Times New Roman" w:hAnsi="Times New Roman" w:cs="Times New Roman"/>
+        </w:rPr>
+      </w:pPr>
+      <w:r>
+        <w:rPr>
+          <w:rFonts w:ascii="Times New Roman" w:hAnsi="Times New Roman" w:cs="Times New Roman"/>
+        </w:rPr>
         <w:t>You pay only for what you use (pay-as-you-go model).</w:t>
       </w:r>
     </w:p>
@@ -76,6 +125,7 @@
       <w:pPr>
         <w:jc w:val="both"/>
         <w:rPr>
+          <w:rFonts w:ascii="Times New Roman" w:hAnsi="Times New Roman" w:cs="Times New Roman"/>
           <w:b/>
           <w:bCs/>
         </w:rPr>
@@ -90,6 +140,7 @@
       </w:r>
       <w:r>
         <w:rPr>
+          <w:rFonts w:ascii="Times New Roman" w:hAnsi="Times New Roman" w:cs="Times New Roman"/>
           <w:b/>
           <w:bCs/>
         </w:rPr>
@@ -99,26 +150,37 @@
     <w:p>
       <w:pPr>
         <w:jc w:val="both"/>
-      </w:pPr>
-      <w:r>
+        <w:rPr>
+          <w:rFonts w:ascii="Times New Roman" w:hAnsi="Times New Roman" w:cs="Times New Roman"/>
+        </w:rPr>
+      </w:pPr>
+      <w:r>
+        <w:rPr>
+          <w:rFonts w:ascii="Times New Roman" w:hAnsi="Times New Roman" w:cs="Times New Roman"/>
+        </w:rPr>
         <w:t>EC2 is a service from AWS that allows users to create and manage virtual machines in the cloud. These machines can be configured with different CPU, memory, storage, and OS, and are used to deploy applications without owning physical hardware.</w:t>
       </w:r>
     </w:p>
     <w:p>
       <w:pPr>
         <w:jc w:val="both"/>
-      </w:pPr>
-    </w:p>
-    <w:p>
-      <w:pPr>
-        <w:jc w:val="both"/>
-        <w:rPr>
-          <w:b/>
-          <w:bCs/>
-        </w:rPr>
-      </w:pPr>
-      <w:r>
-        <w:rPr>
+        <w:rPr>
+          <w:rFonts w:ascii="Times New Roman" w:hAnsi="Times New Roman" w:cs="Times New Roman"/>
+        </w:rPr>
+      </w:pPr>
+    </w:p>
+    <w:p>
+      <w:pPr>
+        <w:jc w:val="both"/>
+        <w:rPr>
+          <w:rFonts w:ascii="Times New Roman" w:hAnsi="Times New Roman" w:cs="Times New Roman"/>
+          <w:b/>
+          <w:bCs/>
+        </w:rPr>
+      </w:pPr>
+      <w:r>
+        <w:rPr>
+          <w:rFonts w:ascii="Times New Roman" w:hAnsi="Times New Roman" w:cs="Times New Roman"/>
           <w:b/>
           <w:bCs/>
         </w:rPr>
@@ -128,52 +190,86 @@
     <w:p>
       <w:pPr>
         <w:jc w:val="both"/>
-      </w:pPr>
-      <w:r>
+        <w:rPr>
+          <w:rFonts w:ascii="Times New Roman" w:hAnsi="Times New Roman" w:cs="Times New Roman"/>
+        </w:rPr>
+      </w:pPr>
+      <w:r>
+        <w:rPr>
+          <w:rFonts w:ascii="Times New Roman" w:hAnsi="Times New Roman" w:cs="Times New Roman"/>
+        </w:rPr>
         <w:t>Instance → Virtual machine</w:t>
       </w:r>
     </w:p>
     <w:p>
       <w:pPr>
         <w:jc w:val="both"/>
-      </w:pPr>
-      <w:r>
+        <w:rPr>
+          <w:rFonts w:ascii="Times New Roman" w:hAnsi="Times New Roman" w:cs="Times New Roman"/>
+        </w:rPr>
+      </w:pPr>
+      <w:r>
+        <w:rPr>
+          <w:rFonts w:ascii="Times New Roman" w:hAnsi="Times New Roman" w:cs="Times New Roman"/>
+        </w:rPr>
         <w:t>AMI (Amazon Machine Image) → Preconfigured OS template</w:t>
       </w:r>
     </w:p>
     <w:p>
       <w:pPr>
         <w:jc w:val="both"/>
-      </w:pPr>
-      <w:r>
+        <w:rPr>
+          <w:rFonts w:ascii="Times New Roman" w:hAnsi="Times New Roman" w:cs="Times New Roman"/>
+        </w:rPr>
+      </w:pPr>
+      <w:r>
+        <w:rPr>
+          <w:rFonts w:ascii="Times New Roman" w:hAnsi="Times New Roman" w:cs="Times New Roman"/>
+        </w:rPr>
         <w:t>Instance Type → CPU/RAM configuration (e.g., t2.micro)</w:t>
       </w:r>
     </w:p>
     <w:p>
       <w:pPr>
         <w:jc w:val="both"/>
-      </w:pPr>
-      <w:r>
+        <w:rPr>
+          <w:rFonts w:ascii="Times New Roman" w:hAnsi="Times New Roman" w:cs="Times New Roman"/>
+        </w:rPr>
+      </w:pPr>
+      <w:r>
+        <w:rPr>
+          <w:rFonts w:ascii="Times New Roman" w:hAnsi="Times New Roman" w:cs="Times New Roman"/>
+        </w:rPr>
         <w:t>Security Group → Firewall rules</w:t>
       </w:r>
     </w:p>
     <w:p>
       <w:pPr>
         <w:jc w:val="both"/>
-      </w:pPr>
-      <w:r>
+        <w:rPr>
+          <w:rFonts w:ascii="Times New Roman" w:hAnsi="Times New Roman" w:cs="Times New Roman"/>
+        </w:rPr>
+      </w:pPr>
+      <w:r>
+        <w:rPr>
+          <w:rFonts w:ascii="Times New Roman" w:hAnsi="Times New Roman" w:cs="Times New Roman"/>
+        </w:rPr>
         <w:t>EBS (Elastic Block Store) → Storage for EC2</w:t>
       </w:r>
     </w:p>
     <w:p>
       <w:pPr>
         <w:jc w:val="both"/>
-      </w:pPr>
-    </w:p>
-    <w:p>
-      <w:pPr>
-        <w:jc w:val="both"/>
-        <w:rPr>
+        <w:rPr>
+          <w:rFonts w:ascii="Times New Roman" w:hAnsi="Times New Roman" w:cs="Times New Roman"/>
+        </w:rPr>
+      </w:pPr>
+    </w:p>
+    <w:p>
+      <w:pPr>
+        <w:jc w:val="both"/>
+        <w:rPr>
+          <w:rFonts w:ascii="Times New Roman" w:hAnsi="Times New Roman" w:cs="Times New Roman"/>
           <w:b/>
           <w:bCs/>
           <w:highlight w:val="yellow"/>
@@ -184,6 +280,7 @@
       <w:pPr>
         <w:jc w:val="both"/>
         <w:rPr>
+          <w:rFonts w:ascii="Times New Roman" w:hAnsi="Times New Roman" w:cs="Times New Roman"/>
           <w:b/>
           <w:bCs/>
           <w:highlight w:val="yellow"/>
@@ -194,6 +291,7 @@
       <w:pPr>
         <w:jc w:val="both"/>
         <w:rPr>
+          <w:rFonts w:ascii="Times New Roman" w:hAnsi="Times New Roman" w:cs="Times New Roman"/>
           <w:b/>
           <w:bCs/>
           <w:highlight w:val="yellow"/>
@@ -204,6 +302,7 @@
       <w:pPr>
         <w:jc w:val="both"/>
         <w:rPr>
+          <w:rFonts w:ascii="Times New Roman" w:hAnsi="Times New Roman" w:cs="Times New Roman"/>
           <w:b/>
           <w:bCs/>
           <w:highlight w:val="yellow"/>
@@ -214,6 +313,7 @@
       <w:pPr>
         <w:jc w:val="both"/>
         <w:rPr>
+          <w:rFonts w:ascii="Times New Roman" w:hAnsi="Times New Roman" w:cs="Times New Roman"/>
           <w:b/>
           <w:bCs/>
           <w:highlight w:val="yellow"/>
@@ -224,6 +324,7 @@
       <w:pPr>
         <w:jc w:val="both"/>
         <w:rPr>
+          <w:rFonts w:ascii="Times New Roman" w:hAnsi="Times New Roman" w:cs="Times New Roman"/>
           <w:b/>
           <w:bCs/>
           <w:highlight w:val="yellow"/>
@@ -234,6 +335,7 @@
       <w:pPr>
         <w:jc w:val="both"/>
         <w:rPr>
+          <w:rFonts w:ascii="Times New Roman" w:hAnsi="Times New Roman" w:cs="Times New Roman"/>
           <w:b/>
           <w:bCs/>
           <w:highlight w:val="yellow"/>
@@ -244,6 +346,7 @@
       <w:pPr>
         <w:jc w:val="both"/>
         <w:rPr>
+          <w:rFonts w:ascii="Times New Roman" w:hAnsi="Times New Roman" w:cs="Times New Roman"/>
           <w:b/>
           <w:bCs/>
           <w:highlight w:val="yellow"/>
@@ -254,6 +357,7 @@
       <w:pPr>
         <w:jc w:val="both"/>
         <w:rPr>
+          <w:rFonts w:ascii="Times New Roman" w:hAnsi="Times New Roman" w:cs="Times New Roman"/>
           <w:b/>
           <w:bCs/>
           <w:highlight w:val="yellow"/>
@@ -264,6 +368,7 @@
       <w:pPr>
         <w:jc w:val="both"/>
         <w:rPr>
+          <w:rFonts w:ascii="Times New Roman" w:hAnsi="Times New Roman" w:cs="Times New Roman"/>
           <w:b/>
           <w:bCs/>
           <w:highlight w:val="yellow"/>
@@ -274,27 +379,63 @@
       <w:pPr>
         <w:jc w:val="both"/>
         <w:rPr>
-          <w:b/>
-          <w:bCs/>
-        </w:rPr>
-      </w:pPr>
-      <w:r>
-        <w:rPr>
+          <w:rFonts w:ascii="Times New Roman" w:hAnsi="Times New Roman" w:cs="Times New Roman"/>
           <w:b/>
           <w:bCs/>
           <w:highlight w:val="yellow"/>
         </w:rPr>
+      </w:pPr>
+    </w:p>
+    <w:p>
+      <w:pPr>
+        <w:jc w:val="both"/>
+        <w:rPr>
+          <w:rFonts w:ascii="Times New Roman" w:hAnsi="Times New Roman" w:cs="Times New Roman"/>
+          <w:b/>
+          <w:bCs/>
+        </w:rPr>
+      </w:pPr>
+      <w:r>
+        <w:rPr>
+          <w:rFonts w:ascii="Times New Roman" w:hAnsi="Times New Roman" w:cs="Times New Roman"/>
+          <w:b/>
+          <w:bCs/>
+          <w:highlight w:val="yellow"/>
+        </w:rPr>
+        <w:lastRenderedPageBreak/>
         <w:t>AWS S3 simple explanation?</w:t>
       </w:r>
     </w:p>
     <w:p>
       <w:pPr>
         <w:jc w:val="both"/>
+        <w:rPr>
+          <w:rFonts w:ascii="Times New Roman" w:hAnsi="Times New Roman" w:cs="Times New Roman"/>
+          <w:b/>
+          <w:bCs/>
+        </w:rPr>
+      </w:pPr>
+      <w:r>
+        <w:rPr>
+          <w:rFonts w:ascii="Times New Roman" w:hAnsi="Times New Roman" w:cs="Times New Roman"/>
+          <w:b/>
+          <w:bCs/>
+        </w:rPr>
+        <w:t>Source:</w:t>
+      </w:r>
+    </w:p>
+    <w:p>
+      <w:pPr>
+        <w:jc w:val="both"/>
+        <w:rPr>
+          <w:rFonts w:ascii="Times New Roman" w:hAnsi="Times New Roman" w:cs="Times New Roman"/>
+        </w:rPr>
       </w:pPr>
       <w:hyperlink r:id="rId5" w:history="1">
         <w:r>
           <w:rPr>
             <w:rStyle w:val="Hyperlink"/>
+            <w:rFonts w:ascii="Times New Roman" w:hAnsi="Times New Roman" w:cs="Times New Roman"/>
           </w:rPr>
           <w:t>https://www.youtube.com/watch?v=mRWm8Y2sV0E</w:t>
         </w:r>
@@ -304,12 +445,14 @@
       <w:pPr>
         <w:jc w:val="both"/>
         <w:rPr>
-          <w:b/>
-          <w:bCs/>
-        </w:rPr>
-      </w:pPr>
-      <w:r>
-        <w:rPr>
+          <w:rFonts w:ascii="Times New Roman" w:hAnsi="Times New Roman" w:cs="Times New Roman"/>
+          <w:b/>
+          <w:bCs/>
+        </w:rPr>
+      </w:pPr>
+      <w:r>
+        <w:rPr>
+          <w:rFonts w:ascii="Times New Roman" w:hAnsi="Times New Roman" w:cs="Times New Roman"/>
           <w:b/>
           <w:bCs/>
         </w:rPr>
@@ -319,24 +462,42 @@
     <w:p>
       <w:pPr>
         <w:jc w:val="both"/>
-      </w:pPr>
-      <w:r>
+        <w:rPr>
+          <w:rFonts w:ascii="Times New Roman" w:hAnsi="Times New Roman" w:cs="Times New Roman"/>
+        </w:rPr>
+      </w:pPr>
+      <w:r>
+        <w:rPr>
+          <w:rFonts w:ascii="Times New Roman" w:hAnsi="Times New Roman" w:cs="Times New Roman"/>
+        </w:rPr>
         <w:t>- Object storage service by AWS</w:t>
       </w:r>
     </w:p>
     <w:p>
       <w:pPr>
         <w:jc w:val="both"/>
-      </w:pPr>
-      <w:r>
+        <w:rPr>
+          <w:rFonts w:ascii="Times New Roman" w:hAnsi="Times New Roman" w:cs="Times New Roman"/>
+        </w:rPr>
+      </w:pPr>
+      <w:r>
+        <w:rPr>
+          <w:rFonts w:ascii="Times New Roman" w:hAnsi="Times New Roman" w:cs="Times New Roman"/>
+        </w:rPr>
         <w:t>- Object = Data + Metadata (info about data)</w:t>
       </w:r>
     </w:p>
     <w:p>
       <w:pPr>
         <w:jc w:val="both"/>
-      </w:pPr>
-      <w:r>
+        <w:rPr>
+          <w:rFonts w:ascii="Times New Roman" w:hAnsi="Times New Roman" w:cs="Times New Roman"/>
+        </w:rPr>
+      </w:pPr>
+      <w:r>
+        <w:rPr>
+          <w:rFonts w:ascii="Times New Roman" w:hAnsi="Times New Roman" w:cs="Times New Roman"/>
+        </w:rPr>
         <w:t>- Data stored inside Buckets</w:t>
       </w:r>
     </w:p>
@@ -344,12 +505,14 @@
       <w:pPr>
         <w:jc w:val="both"/>
         <w:rPr>
-          <w:b/>
-          <w:bCs/>
-        </w:rPr>
-      </w:pPr>
-      <w:r>
-        <w:rPr>
+          <w:rFonts w:ascii="Times New Roman" w:hAnsi="Times New Roman" w:cs="Times New Roman"/>
+          <w:b/>
+          <w:bCs/>
+        </w:rPr>
+      </w:pPr>
+      <w:r>
+        <w:rPr>
+          <w:rFonts w:ascii="Times New Roman" w:hAnsi="Times New Roman" w:cs="Times New Roman"/>
           <w:b/>
           <w:bCs/>
         </w:rPr>
@@ -359,22 +522,40 @@
     <w:p>
       <w:pPr>
         <w:jc w:val="both"/>
-      </w:pPr>
-      <w:r>
+        <w:rPr>
+          <w:rFonts w:ascii="Times New Roman" w:hAnsi="Times New Roman" w:cs="Times New Roman"/>
+        </w:rPr>
+      </w:pPr>
+      <w:r>
+        <w:rPr>
+          <w:rFonts w:ascii="Times New Roman" w:hAnsi="Times New Roman" w:cs="Times New Roman"/>
+        </w:rPr>
         <w:t>- Store and retrieve any amount of data over internet</w:t>
       </w:r>
       <w:r>
+        <w:rPr>
+          <w:rFonts w:ascii="Times New Roman" w:hAnsi="Times New Roman" w:cs="Times New Roman"/>
+        </w:rPr>
         <w:t>.</w:t>
       </w:r>
     </w:p>
     <w:p>
       <w:pPr>
         <w:jc w:val="both"/>
-      </w:pPr>
-      <w:r>
+        <w:rPr>
+          <w:rFonts w:ascii="Times New Roman" w:hAnsi="Times New Roman" w:cs="Times New Roman"/>
+        </w:rPr>
+      </w:pPr>
+      <w:r>
+        <w:rPr>
+          <w:rFonts w:ascii="Times New Roman" w:hAnsi="Times New Roman" w:cs="Times New Roman"/>
+        </w:rPr>
         <w:t>- Used for images, videos, backups, logs</w:t>
       </w:r>
       <w:r>
+        <w:rPr>
+          <w:rFonts w:ascii="Times New Roman" w:hAnsi="Times New Roman" w:cs="Times New Roman"/>
+        </w:rPr>
         <w:t>.</w:t>
       </w:r>
     </w:p>
@@ -382,12 +563,14 @@
       <w:pPr>
         <w:jc w:val="both"/>
         <w:rPr>
-          <w:b/>
-          <w:bCs/>
-        </w:rPr>
-      </w:pPr>
-      <w:r>
-        <w:rPr>
+          <w:rFonts w:ascii="Times New Roman" w:hAnsi="Times New Roman" w:cs="Times New Roman"/>
+          <w:b/>
+          <w:bCs/>
+        </w:rPr>
+      </w:pPr>
+      <w:r>
+        <w:rPr>
+          <w:rFonts w:ascii="Times New Roman" w:hAnsi="Times New Roman" w:cs="Times New Roman"/>
           <w:b/>
           <w:bCs/>
         </w:rPr>
@@ -397,66 +580,112 @@
     <w:p>
       <w:pPr>
         <w:jc w:val="both"/>
-      </w:pPr>
-      <w:r>
+        <w:rPr>
+          <w:rFonts w:ascii="Times New Roman" w:hAnsi="Times New Roman" w:cs="Times New Roman"/>
+        </w:rPr>
+      </w:pPr>
+      <w:r>
+        <w:rPr>
+          <w:rFonts w:ascii="Times New Roman" w:hAnsi="Times New Roman" w:cs="Times New Roman"/>
+        </w:rPr>
         <w:t>- Durability: 99.999999999% (very low data loss)</w:t>
       </w:r>
     </w:p>
     <w:p>
       <w:pPr>
         <w:jc w:val="both"/>
-      </w:pPr>
-      <w:r>
+        <w:rPr>
+          <w:rFonts w:ascii="Times New Roman" w:hAnsi="Times New Roman" w:cs="Times New Roman"/>
+        </w:rPr>
+      </w:pPr>
+      <w:r>
+        <w:rPr>
+          <w:rFonts w:ascii="Times New Roman" w:hAnsi="Times New Roman" w:cs="Times New Roman"/>
+        </w:rPr>
         <w:t>- Availability: 99.99%</w:t>
       </w:r>
     </w:p>
     <w:p>
       <w:pPr>
         <w:jc w:val="both"/>
-      </w:pPr>
-      <w:r>
+        <w:rPr>
+          <w:rFonts w:ascii="Times New Roman" w:hAnsi="Times New Roman" w:cs="Times New Roman"/>
+        </w:rPr>
+      </w:pPr>
+      <w:r>
+        <w:rPr>
+          <w:rFonts w:ascii="Times New Roman" w:hAnsi="Times New Roman" w:cs="Times New Roman"/>
+        </w:rPr>
         <w:t>- Scalable: storage increases/decreases as needed</w:t>
       </w:r>
       <w:r>
+        <w:rPr>
+          <w:rFonts w:ascii="Times New Roman" w:hAnsi="Times New Roman" w:cs="Times New Roman"/>
+        </w:rPr>
         <w:t>.</w:t>
       </w:r>
     </w:p>
     <w:p>
       <w:pPr>
         <w:jc w:val="both"/>
-      </w:pPr>
-      <w:r>
+        <w:rPr>
+          <w:rFonts w:ascii="Times New Roman" w:hAnsi="Times New Roman" w:cs="Times New Roman"/>
+        </w:rPr>
+      </w:pPr>
+      <w:r>
+        <w:rPr>
+          <w:rFonts w:ascii="Times New Roman" w:hAnsi="Times New Roman" w:cs="Times New Roman"/>
+        </w:rPr>
         <w:t>- Cost-effective: pay-as-you-use (no hardware needed)</w:t>
       </w:r>
     </w:p>
     <w:p>
       <w:pPr>
         <w:jc w:val="both"/>
-      </w:pPr>
-      <w:r>
+        <w:rPr>
+          <w:rFonts w:ascii="Times New Roman" w:hAnsi="Times New Roman" w:cs="Times New Roman"/>
+        </w:rPr>
+      </w:pPr>
+      <w:r>
+        <w:rPr>
+          <w:rFonts w:ascii="Times New Roman" w:hAnsi="Times New Roman" w:cs="Times New Roman"/>
+        </w:rPr>
         <w:t>- Secure: supports encryption (in-transit + at-rest)</w:t>
       </w:r>
     </w:p>
     <w:p>
       <w:pPr>
         <w:jc w:val="both"/>
-      </w:pPr>
-      <w:r>
+        <w:rPr>
+          <w:rFonts w:ascii="Times New Roman" w:hAnsi="Times New Roman" w:cs="Times New Roman"/>
+        </w:rPr>
+      </w:pPr>
+      <w:r>
+        <w:rPr>
+          <w:rFonts w:ascii="Times New Roman" w:hAnsi="Times New Roman" w:cs="Times New Roman"/>
+        </w:rPr>
         <w:t xml:space="preserve">Hence, </w:t>
       </w:r>
       <w:r>
+        <w:rPr>
+          <w:rFonts w:ascii="Times New Roman" w:hAnsi="Times New Roman" w:cs="Times New Roman"/>
+        </w:rPr>
         <w:t>“S3 is an object storage service from AWS where data is stored as objects inside buckets. It is highly durable, scalable, and used to store files like images, videos, and backups.”</w:t>
       </w:r>
     </w:p>
     <w:p>
       <w:pPr>
         <w:jc w:val="both"/>
-      </w:pPr>
-    </w:p>
-    <w:p>
-      <w:pPr>
-        <w:jc w:val="both"/>
-        <w:rPr>
+        <w:rPr>
+          <w:rFonts w:ascii="Times New Roman" w:hAnsi="Times New Roman" w:cs="Times New Roman"/>
+        </w:rPr>
+      </w:pPr>
+    </w:p>
+    <w:p>
+      <w:pPr>
+        <w:jc w:val="both"/>
+        <w:rPr>
+          <w:rFonts w:ascii="Times New Roman" w:hAnsi="Times New Roman" w:cs="Times New Roman"/>
           <w:b/>
           <w:bCs/>
         </w:rPr>
@@ -471,6 +700,7 @@
       </w:r>
       <w:r>
         <w:rPr>
+          <w:rFonts w:ascii="Times New Roman" w:hAnsi="Times New Roman" w:cs="Times New Roman"/>
           <w:b/>
           <w:bCs/>
         </w:rPr>
@@ -480,28 +710,42 @@
     <w:p>
       <w:pPr>
         <w:jc w:val="both"/>
-      </w:pPr>
-      <w:r>
+        <w:rPr>
+          <w:rFonts w:ascii="Times New Roman" w:hAnsi="Times New Roman" w:cs="Times New Roman"/>
+        </w:rPr>
+      </w:pPr>
+      <w:r>
+        <w:rPr>
+          <w:rFonts w:ascii="Times New Roman" w:hAnsi="Times New Roman" w:cs="Times New Roman"/>
+        </w:rPr>
         <w:t xml:space="preserve">A </w:t>
       </w:r>
       <w:r>
         <w:rPr>
+          <w:rFonts w:ascii="Times New Roman" w:hAnsi="Times New Roman" w:cs="Times New Roman"/>
           <w:b/>
           <w:bCs/>
         </w:rPr>
         <w:t>Bucket</w:t>
       </w:r>
       <w:r>
+        <w:rPr>
+          <w:rFonts w:ascii="Times New Roman" w:hAnsi="Times New Roman" w:cs="Times New Roman"/>
+        </w:rPr>
         <w:t xml:space="preserve"> is like a </w:t>
       </w:r>
       <w:r>
         <w:rPr>
+          <w:rFonts w:ascii="Times New Roman" w:hAnsi="Times New Roman" w:cs="Times New Roman"/>
           <w:b/>
           <w:bCs/>
         </w:rPr>
         <w:t>top-level container/folder</w:t>
       </w:r>
       <w:r>
+        <w:rPr>
+          <w:rFonts w:ascii="Times New Roman" w:hAnsi="Times New Roman" w:cs="Times New Roman"/>
+        </w:rPr>
         <w:t xml:space="preserve"> in S3.</w:t>
       </w:r>
     </w:p>
@@ -509,12 +753,14 @@
       <w:pPr>
         <w:jc w:val="both"/>
         <w:rPr>
-          <w:b/>
-          <w:bCs/>
-        </w:rPr>
-      </w:pPr>
-      <w:r>
-        <w:rPr>
+          <w:rFonts w:ascii="Times New Roman" w:hAnsi="Times New Roman" w:cs="Times New Roman"/>
+          <w:b/>
+          <w:bCs/>
+        </w:rPr>
+      </w:pPr>
+      <w:r>
+        <w:rPr>
+          <w:rFonts w:ascii="Times New Roman" w:hAnsi="Times New Roman" w:cs="Times New Roman"/>
           <w:b/>
           <w:bCs/>
         </w:rPr>
@@ -528,8 +774,14 @@
           <w:numId w:val="3"/>
         </w:numPr>
         <w:jc w:val="both"/>
-      </w:pPr>
-      <w:r>
+        <w:rPr>
+          <w:rFonts w:ascii="Times New Roman" w:hAnsi="Times New Roman" w:cs="Times New Roman"/>
+        </w:rPr>
+      </w:pPr>
+      <w:r>
+        <w:rPr>
+          <w:rFonts w:ascii="Times New Roman" w:hAnsi="Times New Roman" w:cs="Times New Roman"/>
+        </w:rPr>
         <w:t xml:space="preserve">Globally unique name (e.g., my-app-images-2026) </w:t>
       </w:r>
     </w:p>
@@ -540,18 +792,28 @@
           <w:numId w:val="3"/>
         </w:numPr>
         <w:jc w:val="both"/>
-      </w:pPr>
-      <w:r>
+        <w:rPr>
+          <w:rFonts w:ascii="Times New Roman" w:hAnsi="Times New Roman" w:cs="Times New Roman"/>
+        </w:rPr>
+      </w:pPr>
+      <w:r>
+        <w:rPr>
+          <w:rFonts w:ascii="Times New Roman" w:hAnsi="Times New Roman" w:cs="Times New Roman"/>
+        </w:rPr>
         <w:t xml:space="preserve">Stores </w:t>
       </w:r>
       <w:r>
         <w:rPr>
+          <w:rFonts w:ascii="Times New Roman" w:hAnsi="Times New Roman" w:cs="Times New Roman"/>
           <w:b/>
           <w:bCs/>
         </w:rPr>
         <w:t>objects (files)</w:t>
       </w:r>
       <w:r>
+        <w:rPr>
+          <w:rFonts w:ascii="Times New Roman" w:hAnsi="Times New Roman" w:cs="Times New Roman"/>
+        </w:rPr>
         <w:t xml:space="preserve"> </w:t>
       </w:r>
     </w:p>
@@ -562,18 +824,28 @@
           <w:numId w:val="3"/>
         </w:numPr>
         <w:jc w:val="both"/>
-      </w:pPr>
-      <w:r>
+        <w:rPr>
+          <w:rFonts w:ascii="Times New Roman" w:hAnsi="Times New Roman" w:cs="Times New Roman"/>
+        </w:rPr>
+      </w:pPr>
+      <w:r>
+        <w:rPr>
+          <w:rFonts w:ascii="Times New Roman" w:hAnsi="Times New Roman" w:cs="Times New Roman"/>
+        </w:rPr>
         <w:t xml:space="preserve">Defined in a specific </w:t>
       </w:r>
       <w:r>
         <w:rPr>
+          <w:rFonts w:ascii="Times New Roman" w:hAnsi="Times New Roman" w:cs="Times New Roman"/>
           <w:b/>
           <w:bCs/>
         </w:rPr>
         <w:t>region</w:t>
       </w:r>
       <w:r>
+        <w:rPr>
+          <w:rFonts w:ascii="Times New Roman" w:hAnsi="Times New Roman" w:cs="Times New Roman"/>
+        </w:rPr>
         <w:t xml:space="preserve"> (e.g., ap-south-1) </w:t>
       </w:r>
     </w:p>
@@ -581,39 +853,44 @@
       <w:pPr>
         <w:jc w:val="both"/>
         <w:rPr>
-          <w:b/>
-          <w:bCs/>
-        </w:rPr>
-      </w:pPr>
-    </w:p>
-    <w:p>
-      <w:pPr>
-        <w:jc w:val="both"/>
-        <w:rPr>
-          <w:b/>
-          <w:bCs/>
-        </w:rPr>
-      </w:pPr>
-    </w:p>
-    <w:p>
-      <w:pPr>
-        <w:jc w:val="both"/>
-        <w:rPr>
-          <w:b/>
-          <w:bCs/>
-        </w:rPr>
-      </w:pPr>
-    </w:p>
-    <w:p>
-      <w:pPr>
-        <w:jc w:val="both"/>
-        <w:rPr>
-          <w:b/>
-          <w:bCs/>
-        </w:rPr>
-      </w:pPr>
-      <w:r>
-        <w:rPr>
+          <w:rFonts w:ascii="Times New Roman" w:hAnsi="Times New Roman" w:cs="Times New Roman"/>
+          <w:b/>
+          <w:bCs/>
+        </w:rPr>
+      </w:pPr>
+    </w:p>
+    <w:p>
+      <w:pPr>
+        <w:jc w:val="both"/>
+        <w:rPr>
+          <w:rFonts w:ascii="Times New Roman" w:hAnsi="Times New Roman" w:cs="Times New Roman"/>
+          <w:b/>
+          <w:bCs/>
+        </w:rPr>
+      </w:pPr>
+    </w:p>
+    <w:p>
+      <w:pPr>
+        <w:jc w:val="both"/>
+        <w:rPr>
+          <w:rFonts w:ascii="Times New Roman" w:hAnsi="Times New Roman" w:cs="Times New Roman"/>
+          <w:b/>
+          <w:bCs/>
+        </w:rPr>
+      </w:pPr>
+    </w:p>
+    <w:p>
+      <w:pPr>
+        <w:jc w:val="both"/>
+        <w:rPr>
+          <w:rFonts w:ascii="Times New Roman" w:hAnsi="Times New Roman" w:cs="Times New Roman"/>
+          <w:b/>
+          <w:bCs/>
+        </w:rPr>
+      </w:pPr>
+      <w:r>
+        <w:rPr>
+          <w:rFonts w:ascii="Times New Roman" w:hAnsi="Times New Roman" w:cs="Times New Roman"/>
           <w:b/>
           <w:bCs/>
         </w:rPr>
@@ -622,66 +899,69 @@
     </w:p>
     <w:p>
       <w:pPr>
-        <w:jc w:val="both"/>
-      </w:pPr>
-      <w:r>
+        <w:rPr>
+          <w:rFonts w:ascii="Times New Roman" w:hAnsi="Times New Roman" w:cs="Times New Roman"/>
+        </w:rPr>
+      </w:pPr>
+      <w:r>
+        <w:rPr>
+          <w:rFonts w:ascii="Times New Roman" w:hAnsi="Times New Roman" w:cs="Times New Roman"/>
+        </w:rPr>
+        <w:lastRenderedPageBreak/>
         <w:t>Bucket: user-profile-data</w:t>
       </w:r>
       <w:r>
+        <w:rPr>
+          <w:rFonts w:ascii="Times New Roman" w:hAnsi="Times New Roman" w:cs="Times New Roman"/>
+        </w:rPr>
         <w:br/>
         <w:t xml:space="preserve">   </w:t>
       </w:r>
       <w:r>
         <w:rPr>
-          <w:rFonts w:ascii="MS Gothic" w:eastAsia="MS Gothic" w:hAnsi="MS Gothic" w:cs="MS Gothic" w:hint="eastAsia"/>
+          <w:rFonts w:ascii="Times New Roman" w:eastAsia="MS Gothic" w:hAnsi="Times New Roman" w:cs="Times New Roman"/>
         </w:rPr>
         <w:t>├</w:t>
       </w:r>
       <w:r>
         <w:rPr>
-          <w:rFonts w:ascii="Aptos" w:hAnsi="Aptos" w:cs="Aptos"/>
-        </w:rPr>
-        <w:t>──</w:t>
-      </w:r>
-      <w:r>
-        <w:t xml:space="preserve"> user1.jpg</w:t>
-      </w:r>
-      <w:r>
+          <w:rFonts w:ascii="Times New Roman" w:hAnsi="Times New Roman" w:cs="Times New Roman"/>
+        </w:rPr>
+        <w:t>── user1.jpg</w:t>
+      </w:r>
+      <w:r>
+        <w:rPr>
+          <w:rFonts w:ascii="Times New Roman" w:hAnsi="Times New Roman" w:cs="Times New Roman"/>
+        </w:rPr>
         <w:br/>
         <w:t xml:space="preserve">   </w:t>
       </w:r>
       <w:r>
         <w:rPr>
-          <w:rFonts w:ascii="MS Gothic" w:eastAsia="MS Gothic" w:hAnsi="MS Gothic" w:cs="MS Gothic" w:hint="eastAsia"/>
+          <w:rFonts w:ascii="Times New Roman" w:eastAsia="MS Gothic" w:hAnsi="Times New Roman" w:cs="Times New Roman"/>
         </w:rPr>
         <w:t>├</w:t>
       </w:r>
       <w:r>
         <w:rPr>
-          <w:rFonts w:ascii="Aptos" w:hAnsi="Aptos" w:cs="Aptos"/>
-        </w:rPr>
-        <w:t>──</w:t>
-      </w:r>
-      <w:r>
-        <w:t xml:space="preserve"> user2.jpg</w:t>
-      </w:r>
-      <w:r>
+          <w:rFonts w:ascii="Times New Roman" w:hAnsi="Times New Roman" w:cs="Times New Roman"/>
+        </w:rPr>
+        <w:t>── user2.jpg</w:t>
+      </w:r>
+      <w:r>
+        <w:rPr>
+          <w:rFonts w:ascii="Times New Roman" w:hAnsi="Times New Roman" w:cs="Times New Roman"/>
+        </w:rPr>
         <w:br/>
-        <w:t xml:space="preserve">   </w:t>
-      </w:r>
-      <w:r>
-        <w:rPr>
-          <w:rFonts w:ascii="Aptos" w:hAnsi="Aptos" w:cs="Aptos"/>
-        </w:rPr>
-        <w:t>└──</w:t>
-      </w:r>
-      <w:r>
-        <w:t xml:space="preserve"> resume.pdf</w:t>
-      </w:r>
-    </w:p>
-    <w:p>
-      <w:pPr>
-        <w:jc w:val="both"/>
+        <w:t xml:space="preserve">   └── resume.pdf</w:t>
+      </w:r>
+    </w:p>
+    <w:p>
+      <w:pPr>
+        <w:jc w:val="both"/>
+        <w:rPr>
+          <w:rFonts w:ascii="Times New Roman" w:hAnsi="Times New Roman" w:cs="Times New Roman"/>
+        </w:rPr>
       </w:pPr>
       <w:r>
         <w:rPr>
@@ -690,6 +970,9 @@
         <w:t>👉</w:t>
       </w:r>
       <w:r>
+        <w:rPr>
+          <w:rFonts w:ascii="Times New Roman" w:hAnsi="Times New Roman" w:cs="Times New Roman"/>
+        </w:rPr>
         <w:t xml:space="preserve"> Think:</w:t>
       </w:r>
     </w:p>
@@ -700,8 +983,14 @@
           <w:numId w:val="4"/>
         </w:numPr>
         <w:jc w:val="both"/>
-      </w:pPr>
-      <w:r>
+        <w:rPr>
+          <w:rFonts w:ascii="Times New Roman" w:hAnsi="Times New Roman" w:cs="Times New Roman"/>
+        </w:rPr>
+      </w:pPr>
+      <w:r>
+        <w:rPr>
+          <w:rFonts w:ascii="Times New Roman" w:hAnsi="Times New Roman" w:cs="Times New Roman"/>
+        </w:rPr>
         <w:t xml:space="preserve">Bucket = Folder </w:t>
       </w:r>
     </w:p>
@@ -712,26 +1001,37 @@
           <w:numId w:val="4"/>
         </w:numPr>
         <w:jc w:val="both"/>
-      </w:pPr>
-      <w:r>
+        <w:rPr>
+          <w:rFonts w:ascii="Times New Roman" w:hAnsi="Times New Roman" w:cs="Times New Roman"/>
+        </w:rPr>
+      </w:pPr>
+      <w:r>
+        <w:rPr>
+          <w:rFonts w:ascii="Times New Roman" w:hAnsi="Times New Roman" w:cs="Times New Roman"/>
+        </w:rPr>
         <w:t>Object = File</w:t>
       </w:r>
     </w:p>
     <w:p>
       <w:pPr>
         <w:jc w:val="both"/>
-      </w:pPr>
-    </w:p>
-    <w:p>
-      <w:pPr>
-        <w:jc w:val="both"/>
-        <w:rPr>
-          <w:b/>
-          <w:bCs/>
-        </w:rPr>
-      </w:pPr>
-      <w:r>
-        <w:rPr>
+        <w:rPr>
+          <w:rFonts w:ascii="Times New Roman" w:hAnsi="Times New Roman" w:cs="Times New Roman"/>
+        </w:rPr>
+      </w:pPr>
+    </w:p>
+    <w:p>
+      <w:pPr>
+        <w:jc w:val="both"/>
+        <w:rPr>
+          <w:rFonts w:ascii="Times New Roman" w:hAnsi="Times New Roman" w:cs="Times New Roman"/>
+          <w:b/>
+          <w:bCs/>
+        </w:rPr>
+      </w:pPr>
+      <w:r>
+        <w:rPr>
+          <w:rFonts w:ascii="Times New Roman" w:hAnsi="Times New Roman" w:cs="Times New Roman"/>
           <w:b/>
           <w:bCs/>
         </w:rPr>
@@ -741,18 +1041,28 @@
     <w:p>
       <w:pPr>
         <w:jc w:val="both"/>
-      </w:pPr>
-      <w:r>
+        <w:rPr>
+          <w:rFonts w:ascii="Times New Roman" w:hAnsi="Times New Roman" w:cs="Times New Roman"/>
+        </w:rPr>
+      </w:pPr>
+      <w:r>
+        <w:rPr>
+          <w:rFonts w:ascii="Times New Roman" w:hAnsi="Times New Roman" w:cs="Times New Roman"/>
+        </w:rPr>
         <w:t xml:space="preserve">S3 uses </w:t>
       </w:r>
       <w:r>
         <w:rPr>
+          <w:rFonts w:ascii="Times New Roman" w:hAnsi="Times New Roman" w:cs="Times New Roman"/>
           <w:b/>
           <w:bCs/>
         </w:rPr>
         <w:t>Object Storage</w:t>
       </w:r>
       <w:r>
+        <w:rPr>
+          <w:rFonts w:ascii="Times New Roman" w:hAnsi="Times New Roman" w:cs="Times New Roman"/>
+        </w:rPr>
         <w:t>, not traditional file system or block storage.</w:t>
       </w:r>
     </w:p>
@@ -760,12 +1070,14 @@
       <w:pPr>
         <w:jc w:val="both"/>
         <w:rPr>
-          <w:b/>
-          <w:bCs/>
-        </w:rPr>
-      </w:pPr>
-      <w:r>
-        <w:rPr>
+          <w:rFonts w:ascii="Times New Roman" w:hAnsi="Times New Roman" w:cs="Times New Roman"/>
+          <w:b/>
+          <w:bCs/>
+        </w:rPr>
+      </w:pPr>
+      <w:r>
+        <w:rPr>
+          <w:rFonts w:ascii="Times New Roman" w:hAnsi="Times New Roman" w:cs="Times New Roman"/>
           <w:b/>
           <w:bCs/>
         </w:rPr>
@@ -779,15 +1091,22 @@
           <w:numId w:val="5"/>
         </w:numPr>
         <w:jc w:val="both"/>
-      </w:pPr>
-      <w:r>
-        <w:rPr>
+        <w:rPr>
+          <w:rFonts w:ascii="Times New Roman" w:hAnsi="Times New Roman" w:cs="Times New Roman"/>
+        </w:rPr>
+      </w:pPr>
+      <w:r>
+        <w:rPr>
+          <w:rFonts w:ascii="Times New Roman" w:hAnsi="Times New Roman" w:cs="Times New Roman"/>
           <w:b/>
           <w:bCs/>
         </w:rPr>
         <w:t>Data (file itself)</w:t>
       </w:r>
       <w:r>
+        <w:rPr>
+          <w:rFonts w:ascii="Times New Roman" w:hAnsi="Times New Roman" w:cs="Times New Roman"/>
+        </w:rPr>
         <w:t xml:space="preserve"> → image, video, JSON, etc. </w:t>
       </w:r>
     </w:p>
@@ -798,15 +1117,22 @@
           <w:numId w:val="5"/>
         </w:numPr>
         <w:jc w:val="both"/>
-      </w:pPr>
-      <w:r>
-        <w:rPr>
+        <w:rPr>
+          <w:rFonts w:ascii="Times New Roman" w:hAnsi="Times New Roman" w:cs="Times New Roman"/>
+        </w:rPr>
+      </w:pPr>
+      <w:r>
+        <w:rPr>
+          <w:rFonts w:ascii="Times New Roman" w:hAnsi="Times New Roman" w:cs="Times New Roman"/>
           <w:b/>
           <w:bCs/>
         </w:rPr>
         <w:t>Metadata</w:t>
       </w:r>
       <w:r>
+        <w:rPr>
+          <w:rFonts w:ascii="Times New Roman" w:hAnsi="Times New Roman" w:cs="Times New Roman"/>
+        </w:rPr>
         <w:t xml:space="preserve"> → content-type, size, etc. </w:t>
       </w:r>
     </w:p>
@@ -817,21 +1143,31 @@
           <w:numId w:val="5"/>
         </w:numPr>
         <w:jc w:val="both"/>
-      </w:pPr>
-      <w:r>
-        <w:rPr>
+        <w:rPr>
+          <w:rFonts w:ascii="Times New Roman" w:hAnsi="Times New Roman" w:cs="Times New Roman"/>
+        </w:rPr>
+      </w:pPr>
+      <w:r>
+        <w:rPr>
+          <w:rFonts w:ascii="Times New Roman" w:hAnsi="Times New Roman" w:cs="Times New Roman"/>
           <w:b/>
           <w:bCs/>
         </w:rPr>
         <w:t>Key (unique identifier)</w:t>
       </w:r>
       <w:r>
+        <w:rPr>
+          <w:rFonts w:ascii="Times New Roman" w:hAnsi="Times New Roman" w:cs="Times New Roman"/>
+        </w:rPr>
         <w:t xml:space="preserve"> → like file path</w:t>
       </w:r>
     </w:p>
     <w:p>
       <w:pPr>
         <w:jc w:val="both"/>
+        <w:rPr>
+          <w:rFonts w:ascii="Times New Roman" w:hAnsi="Times New Roman" w:cs="Times New Roman"/>
+        </w:rPr>
       </w:pPr>
       <w:r>
         <w:rPr>
@@ -839,14 +1175,15 @@
           <w:b/>
           <w:bCs/>
           <w:kern w:val="0"/>
-          <w:sz w:val="27"/>
-          <w:szCs w:val="27"/>
           <w:lang w:eastAsia="en-IN"/>
           <w14:ligatures w14:val="none"/>
         </w:rPr>
         <w:t>Example:</w:t>
       </w:r>
       <w:r>
+        <w:rPr>
+          <w:rFonts w:ascii="Times New Roman" w:hAnsi="Times New Roman" w:cs="Times New Roman"/>
+        </w:rPr>
         <w:t xml:space="preserve"> </w:t>
       </w:r>
     </w:p>
@@ -854,42 +1191,50 @@
       <w:pPr>
         <w:jc w:val="both"/>
         <w:rPr>
-          <w:rFonts w:ascii="Courier New" w:eastAsia="Times New Roman" w:hAnsi="Courier New" w:cs="Courier New"/>
+          <w:rFonts w:ascii="Times New Roman" w:eastAsia="Times New Roman" w:hAnsi="Times New Roman" w:cs="Times New Roman"/>
           <w:kern w:val="0"/>
-          <w:sz w:val="20"/>
-          <w:szCs w:val="20"/>
           <w:lang w:eastAsia="en-IN"/>
           <w14:ligatures w14:val="none"/>
         </w:rPr>
       </w:pPr>
       <w:r>
         <w:rPr>
-          <w:rFonts w:ascii="Courier New" w:eastAsia="Times New Roman" w:hAnsi="Courier New" w:cs="Courier New"/>
+          <w:rFonts w:ascii="Times New Roman" w:eastAsia="Times New Roman" w:hAnsi="Times New Roman" w:cs="Times New Roman"/>
+          <w:b/>
+          <w:bCs/>
           <w:kern w:val="0"/>
-          <w:sz w:val="20"/>
-          <w:szCs w:val="20"/>
           <w:lang w:eastAsia="en-IN"/>
           <w14:ligatures w14:val="none"/>
         </w:rPr>
-        <w:t>Key: images/profile/user1.png</w:t>
-      </w:r>
-    </w:p>
-    <w:p>
-      <w:pPr>
-        <w:jc w:val="both"/>
-        <w:rPr>
-          <w:rFonts w:ascii="Courier New" w:eastAsia="Times New Roman" w:hAnsi="Courier New" w:cs="Courier New"/>
+        <w:t>Key:</w:t>
+      </w:r>
+      <w:r>
+        <w:rPr>
+          <w:rFonts w:ascii="Times New Roman" w:eastAsia="Times New Roman" w:hAnsi="Times New Roman" w:cs="Times New Roman"/>
           <w:kern w:val="0"/>
-          <w:sz w:val="20"/>
-          <w:szCs w:val="20"/>
           <w:lang w:eastAsia="en-IN"/>
           <w14:ligatures w14:val="none"/>
         </w:rPr>
-      </w:pPr>
-    </w:p>
-    <w:p>
-      <w:pPr>
-        <w:jc w:val="both"/>
+        <w:t xml:space="preserve"> images/profile/user1.png</w:t>
+      </w:r>
+    </w:p>
+    <w:p>
+      <w:pPr>
+        <w:jc w:val="both"/>
+        <w:rPr>
+          <w:rFonts w:ascii="Times New Roman" w:eastAsia="Times New Roman" w:hAnsi="Times New Roman" w:cs="Times New Roman"/>
+          <w:kern w:val="0"/>
+          <w:lang w:eastAsia="en-IN"/>
+          <w14:ligatures w14:val="none"/>
+        </w:rPr>
+      </w:pPr>
+    </w:p>
+    <w:p>
+      <w:pPr>
+        <w:jc w:val="both"/>
+        <w:rPr>
+          <w:rFonts w:ascii="Times New Roman" w:hAnsi="Times New Roman" w:cs="Times New Roman"/>
+        </w:rPr>
       </w:pPr>
       <w:r>
         <w:rPr>
@@ -898,10 +1243,14 @@
         <w:t>👉</w:t>
       </w:r>
       <w:r>
+        <w:rPr>
+          <w:rFonts w:ascii="Times New Roman" w:hAnsi="Times New Roman" w:cs="Times New Roman"/>
+        </w:rPr>
         <w:t xml:space="preserve"> S3 doesn't really have folders — it's just </w:t>
       </w:r>
       <w:r>
         <w:rPr>
+          <w:rFonts w:ascii="Times New Roman" w:hAnsi="Times New Roman" w:cs="Times New Roman"/>
           <w:b/>
           <w:bCs/>
         </w:rPr>
@@ -911,6 +1260,9 @@
     <w:p>
       <w:pPr>
         <w:jc w:val="both"/>
+        <w:rPr>
+          <w:rFonts w:ascii="Times New Roman" w:hAnsi="Times New Roman" w:cs="Times New Roman"/>
+        </w:rPr>
       </w:pPr>
     </w:p>
     <w:tbl>
@@ -953,12 +1305,14 @@
             <w:pPr>
               <w:jc w:val="both"/>
               <w:rPr>
+                <w:rFonts w:ascii="Times New Roman" w:hAnsi="Times New Roman" w:cs="Times New Roman"/>
                 <w:b/>
                 <w:bCs/>
               </w:rPr>
             </w:pPr>
             <w:r>
               <w:rPr>
+                <w:rFonts w:ascii="Times New Roman" w:hAnsi="Times New Roman" w:cs="Times New Roman"/>
                 <w:b/>
                 <w:bCs/>
               </w:rPr>
@@ -976,12 +1330,14 @@
             <w:pPr>
               <w:jc w:val="both"/>
               <w:rPr>
+                <w:rFonts w:ascii="Times New Roman" w:hAnsi="Times New Roman" w:cs="Times New Roman"/>
                 <w:b/>
                 <w:bCs/>
               </w:rPr>
             </w:pPr>
             <w:r>
               <w:rPr>
+                <w:rFonts w:ascii="Times New Roman" w:hAnsi="Times New Roman" w:cs="Times New Roman"/>
                 <w:b/>
                 <w:bCs/>
               </w:rPr>
@@ -999,12 +1355,14 @@
             <w:pPr>
               <w:jc w:val="both"/>
               <w:rPr>
+                <w:rFonts w:ascii="Times New Roman" w:hAnsi="Times New Roman" w:cs="Times New Roman"/>
                 <w:b/>
                 <w:bCs/>
               </w:rPr>
             </w:pPr>
             <w:r>
               <w:rPr>
+                <w:rFonts w:ascii="Times New Roman" w:hAnsi="Times New Roman" w:cs="Times New Roman"/>
                 <w:b/>
                 <w:bCs/>
               </w:rPr>
@@ -1026,8 +1384,14 @@
           <w:p>
             <w:pPr>
               <w:jc w:val="both"/>
+              <w:rPr>
+                <w:rFonts w:ascii="Times New Roman" w:hAnsi="Times New Roman" w:cs="Times New Roman"/>
+              </w:rPr>
             </w:pPr>
             <w:r>
+              <w:rPr>
+                <w:rFonts w:ascii="Times New Roman" w:hAnsi="Times New Roman" w:cs="Times New Roman"/>
+              </w:rPr>
               <w:t>Structure</w:t>
             </w:r>
           </w:p>
@@ -1041,8 +1405,14 @@
           <w:p>
             <w:pPr>
               <w:jc w:val="both"/>
+              <w:rPr>
+                <w:rFonts w:ascii="Times New Roman" w:hAnsi="Times New Roman" w:cs="Times New Roman"/>
+              </w:rPr>
             </w:pPr>
             <w:r>
+              <w:rPr>
+                <w:rFonts w:ascii="Times New Roman" w:hAnsi="Times New Roman" w:cs="Times New Roman"/>
+              </w:rPr>
               <w:t>Flat (key-based)</w:t>
             </w:r>
           </w:p>
@@ -1056,8 +1426,14 @@
           <w:p>
             <w:pPr>
               <w:jc w:val="both"/>
+              <w:rPr>
+                <w:rFonts w:ascii="Times New Roman" w:hAnsi="Times New Roman" w:cs="Times New Roman"/>
+              </w:rPr>
             </w:pPr>
             <w:r>
+              <w:rPr>
+                <w:rFonts w:ascii="Times New Roman" w:hAnsi="Times New Roman" w:cs="Times New Roman"/>
+              </w:rPr>
               <w:t>Hierarchical</w:t>
             </w:r>
           </w:p>
@@ -1076,8 +1452,14 @@
           <w:p>
             <w:pPr>
               <w:jc w:val="both"/>
+              <w:rPr>
+                <w:rFonts w:ascii="Times New Roman" w:hAnsi="Times New Roman" w:cs="Times New Roman"/>
+              </w:rPr>
             </w:pPr>
             <w:r>
+              <w:rPr>
+                <w:rFonts w:ascii="Times New Roman" w:hAnsi="Times New Roman" w:cs="Times New Roman"/>
+              </w:rPr>
               <w:t>Access</w:t>
             </w:r>
           </w:p>
@@ -1091,8 +1473,14 @@
           <w:p>
             <w:pPr>
               <w:jc w:val="both"/>
+              <w:rPr>
+                <w:rFonts w:ascii="Times New Roman" w:hAnsi="Times New Roman" w:cs="Times New Roman"/>
+              </w:rPr>
             </w:pPr>
             <w:r>
+              <w:rPr>
+                <w:rFonts w:ascii="Times New Roman" w:hAnsi="Times New Roman" w:cs="Times New Roman"/>
+              </w:rPr>
               <w:t>API/HTTP</w:t>
             </w:r>
           </w:p>
@@ -1106,8 +1494,14 @@
           <w:p>
             <w:pPr>
               <w:jc w:val="both"/>
+              <w:rPr>
+                <w:rFonts w:ascii="Times New Roman" w:hAnsi="Times New Roman" w:cs="Times New Roman"/>
+              </w:rPr>
             </w:pPr>
             <w:r>
+              <w:rPr>
+                <w:rFonts w:ascii="Times New Roman" w:hAnsi="Times New Roman" w:cs="Times New Roman"/>
+              </w:rPr>
               <w:t>OS-based</w:t>
             </w:r>
           </w:p>
@@ -1126,8 +1520,14 @@
           <w:p>
             <w:pPr>
               <w:jc w:val="both"/>
+              <w:rPr>
+                <w:rFonts w:ascii="Times New Roman" w:hAnsi="Times New Roman" w:cs="Times New Roman"/>
+              </w:rPr>
             </w:pPr>
             <w:r>
+              <w:rPr>
+                <w:rFonts w:ascii="Times New Roman" w:hAnsi="Times New Roman" w:cs="Times New Roman"/>
+              </w:rPr>
               <w:t>Scalability</w:t>
             </w:r>
           </w:p>
@@ -1141,8 +1541,14 @@
           <w:p>
             <w:pPr>
               <w:jc w:val="both"/>
+              <w:rPr>
+                <w:rFonts w:ascii="Times New Roman" w:hAnsi="Times New Roman" w:cs="Times New Roman"/>
+              </w:rPr>
             </w:pPr>
             <w:r>
+              <w:rPr>
+                <w:rFonts w:ascii="Times New Roman" w:hAnsi="Times New Roman" w:cs="Times New Roman"/>
+              </w:rPr>
               <w:t>Infinite</w:t>
             </w:r>
           </w:p>
@@ -1156,8 +1562,14 @@
           <w:p>
             <w:pPr>
               <w:jc w:val="both"/>
+              <w:rPr>
+                <w:rFonts w:ascii="Times New Roman" w:hAnsi="Times New Roman" w:cs="Times New Roman"/>
+              </w:rPr>
             </w:pPr>
             <w:r>
+              <w:rPr>
+                <w:rFonts w:ascii="Times New Roman" w:hAnsi="Times New Roman" w:cs="Times New Roman"/>
+              </w:rPr>
               <w:t>Limited</w:t>
             </w:r>
           </w:p>
@@ -1167,46 +1579,74 @@
     <w:p>
       <w:pPr>
         <w:jc w:val="both"/>
-      </w:pPr>
-    </w:p>
-    <w:p>
-      <w:pPr>
-        <w:jc w:val="both"/>
-      </w:pPr>
-    </w:p>
-    <w:p>
-      <w:pPr>
-        <w:jc w:val="both"/>
-      </w:pPr>
-    </w:p>
-    <w:p>
-      <w:pPr>
-        <w:jc w:val="both"/>
-      </w:pPr>
-    </w:p>
-    <w:p>
-      <w:pPr>
-        <w:jc w:val="both"/>
-      </w:pPr>
-    </w:p>
-    <w:p>
-      <w:pPr>
-        <w:jc w:val="both"/>
-        <w:rPr>
-          <w:b/>
-          <w:bCs/>
-        </w:rPr>
-      </w:pPr>
-      <w:r>
+        <w:rPr>
+          <w:rFonts w:ascii="Times New Roman" w:hAnsi="Times New Roman" w:cs="Times New Roman"/>
+        </w:rPr>
+      </w:pPr>
+    </w:p>
+    <w:p>
+      <w:pPr>
+        <w:jc w:val="both"/>
+        <w:rPr>
+          <w:rFonts w:ascii="Times New Roman" w:hAnsi="Times New Roman" w:cs="Times New Roman"/>
+        </w:rPr>
+      </w:pPr>
+    </w:p>
+    <w:p>
+      <w:pPr>
+        <w:jc w:val="both"/>
+        <w:rPr>
+          <w:rFonts w:ascii="Times New Roman" w:hAnsi="Times New Roman" w:cs="Times New Roman"/>
+        </w:rPr>
+      </w:pPr>
+    </w:p>
+    <w:p>
+      <w:pPr>
+        <w:jc w:val="both"/>
+        <w:rPr>
+          <w:rFonts w:ascii="Times New Roman" w:hAnsi="Times New Roman" w:cs="Times New Roman"/>
+        </w:rPr>
+      </w:pPr>
+    </w:p>
+    <w:p>
+      <w:pPr>
+        <w:jc w:val="both"/>
+        <w:rPr>
+          <w:rFonts w:ascii="Times New Roman" w:hAnsi="Times New Roman" w:cs="Times New Roman"/>
+        </w:rPr>
+      </w:pPr>
+    </w:p>
+    <w:p>
+      <w:pPr>
+        <w:jc w:val="both"/>
         <w:rPr>
           <w:rFonts w:ascii="Segoe UI Emoji" w:hAnsi="Segoe UI Emoji" w:cs="Segoe UI Emoji"/>
           <w:b/>
           <w:bCs/>
         </w:rPr>
+      </w:pPr>
+    </w:p>
+    <w:p>
+      <w:pPr>
+        <w:jc w:val="both"/>
+        <w:rPr>
+          <w:rFonts w:ascii="Times New Roman" w:hAnsi="Times New Roman" w:cs="Times New Roman"/>
+          <w:b/>
+          <w:bCs/>
+        </w:rPr>
+      </w:pPr>
+      <w:r>
+        <w:rPr>
+          <w:rFonts w:ascii="Segoe UI Emoji" w:hAnsi="Segoe UI Emoji" w:cs="Segoe UI Emoji"/>
+          <w:b/>
+          <w:bCs/>
+        </w:rPr>
+        <w:lastRenderedPageBreak/>
         <w:t>🔐</w:t>
       </w:r>
       <w:r>
         <w:rPr>
+          <w:rFonts w:ascii="Times New Roman" w:hAnsi="Times New Roman" w:cs="Times New Roman"/>
           <w:b/>
           <w:bCs/>
         </w:rPr>
@@ -1217,6 +1657,7 @@
       <w:pPr>
         <w:jc w:val="both"/>
         <w:rPr>
+          <w:rFonts w:ascii="Times New Roman" w:hAnsi="Times New Roman" w:cs="Times New Roman"/>
           <w:b/>
           <w:bCs/>
         </w:rPr>
@@ -1231,6 +1672,7 @@
       </w:r>
       <w:r>
         <w:rPr>
+          <w:rFonts w:ascii="Times New Roman" w:hAnsi="Times New Roman" w:cs="Times New Roman"/>
           <w:b/>
           <w:bCs/>
         </w:rPr>
@@ -1244,18 +1686,28 @@
           <w:numId w:val="6"/>
         </w:numPr>
         <w:jc w:val="both"/>
-      </w:pPr>
-      <w:r>
+        <w:rPr>
+          <w:rFonts w:ascii="Times New Roman" w:hAnsi="Times New Roman" w:cs="Times New Roman"/>
+        </w:rPr>
+      </w:pPr>
+      <w:r>
+        <w:rPr>
+          <w:rFonts w:ascii="Times New Roman" w:hAnsi="Times New Roman" w:cs="Times New Roman"/>
+        </w:rPr>
         <w:t xml:space="preserve">Only </w:t>
       </w:r>
       <w:r>
         <w:rPr>
+          <w:rFonts w:ascii="Times New Roman" w:hAnsi="Times New Roman" w:cs="Times New Roman"/>
           <w:b/>
           <w:bCs/>
         </w:rPr>
         <w:t>owner (IAM user/role)</w:t>
       </w:r>
       <w:r>
+        <w:rPr>
+          <w:rFonts w:ascii="Times New Roman" w:hAnsi="Times New Roman" w:cs="Times New Roman"/>
+        </w:rPr>
         <w:t xml:space="preserve"> can access </w:t>
       </w:r>
     </w:p>
@@ -1266,8 +1718,14 @@
           <w:numId w:val="6"/>
         </w:numPr>
         <w:jc w:val="both"/>
-      </w:pPr>
-      <w:r>
+        <w:rPr>
+          <w:rFonts w:ascii="Times New Roman" w:hAnsi="Times New Roman" w:cs="Times New Roman"/>
+        </w:rPr>
+      </w:pPr>
+      <w:r>
+        <w:rPr>
+          <w:rFonts w:ascii="Times New Roman" w:hAnsi="Times New Roman" w:cs="Times New Roman"/>
+        </w:rPr>
         <w:t xml:space="preserve">Secure by default </w:t>
       </w:r>
     </w:p>
@@ -1278,8 +1736,14 @@
           <w:numId w:val="6"/>
         </w:numPr>
         <w:jc w:val="both"/>
-      </w:pPr>
-      <w:r>
+        <w:rPr>
+          <w:rFonts w:ascii="Times New Roman" w:hAnsi="Times New Roman" w:cs="Times New Roman"/>
+        </w:rPr>
+      </w:pPr>
+      <w:r>
+        <w:rPr>
+          <w:rFonts w:ascii="Times New Roman" w:hAnsi="Times New Roman" w:cs="Times New Roman"/>
+        </w:rPr>
         <w:t xml:space="preserve">Used for: </w:t>
       </w:r>
     </w:p>
@@ -1290,8 +1754,14 @@
           <w:numId w:val="6"/>
         </w:numPr>
         <w:jc w:val="both"/>
-      </w:pPr>
-      <w:r>
+        <w:rPr>
+          <w:rFonts w:ascii="Times New Roman" w:hAnsi="Times New Roman" w:cs="Times New Roman"/>
+        </w:rPr>
+      </w:pPr>
+      <w:r>
+        <w:rPr>
+          <w:rFonts w:ascii="Times New Roman" w:hAnsi="Times New Roman" w:cs="Times New Roman"/>
+        </w:rPr>
         <w:t xml:space="preserve">Backups </w:t>
       </w:r>
     </w:p>
@@ -1302,8 +1772,14 @@
           <w:numId w:val="6"/>
         </w:numPr>
         <w:jc w:val="both"/>
-      </w:pPr>
-      <w:r>
+        <w:rPr>
+          <w:rFonts w:ascii="Times New Roman" w:hAnsi="Times New Roman" w:cs="Times New Roman"/>
+        </w:rPr>
+      </w:pPr>
+      <w:r>
+        <w:rPr>
+          <w:rFonts w:ascii="Times New Roman" w:hAnsi="Times New Roman" w:cs="Times New Roman"/>
+        </w:rPr>
         <w:t xml:space="preserve">Sensitive data </w:t>
       </w:r>
     </w:p>
@@ -1314,16 +1790,28 @@
           <w:numId w:val="6"/>
         </w:numPr>
         <w:jc w:val="both"/>
-      </w:pPr>
-      <w:r>
+        <w:rPr>
+          <w:rFonts w:ascii="Times New Roman" w:hAnsi="Times New Roman" w:cs="Times New Roman"/>
+        </w:rPr>
+      </w:pPr>
+      <w:r>
+        <w:rPr>
+          <w:rFonts w:ascii="Times New Roman" w:hAnsi="Times New Roman" w:cs="Times New Roman"/>
+        </w:rPr>
         <w:t xml:space="preserve">Logs </w:t>
       </w:r>
     </w:p>
     <w:p>
       <w:pPr>
         <w:jc w:val="both"/>
-      </w:pPr>
-      <w:r>
+        <w:rPr>
+          <w:rFonts w:ascii="Times New Roman" w:hAnsi="Times New Roman" w:cs="Times New Roman"/>
+        </w:rPr>
+      </w:pPr>
+      <w:r>
+        <w:rPr>
+          <w:rFonts w:ascii="Times New Roman" w:hAnsi="Times New Roman" w:cs="Times New Roman"/>
+        </w:rPr>
         <w:pict w14:anchorId="7D35922B">
           <v:rect id="_x0000_i1025" style="width:0;height:1.5pt" o:hralign="center" o:hrstd="t" o:hr="t" fillcolor="#a0a0a0" stroked="f"/>
         </w:pict>
@@ -1333,6 +1821,7 @@
       <w:pPr>
         <w:jc w:val="both"/>
         <w:rPr>
+          <w:rFonts w:ascii="Times New Roman" w:hAnsi="Times New Roman" w:cs="Times New Roman"/>
           <w:b/>
           <w:bCs/>
         </w:rPr>
@@ -1347,6 +1836,7 @@
       </w:r>
       <w:r>
         <w:rPr>
+          <w:rFonts w:ascii="Times New Roman" w:hAnsi="Times New Roman" w:cs="Times New Roman"/>
           <w:b/>
           <w:bCs/>
         </w:rPr>
@@ -1360,8 +1850,14 @@
           <w:numId w:val="7"/>
         </w:numPr>
         <w:jc w:val="both"/>
-      </w:pPr>
-      <w:r>
+        <w:rPr>
+          <w:rFonts w:ascii="Times New Roman" w:hAnsi="Times New Roman" w:cs="Times New Roman"/>
+        </w:rPr>
+      </w:pPr>
+      <w:r>
+        <w:rPr>
+          <w:rFonts w:ascii="Times New Roman" w:hAnsi="Times New Roman" w:cs="Times New Roman"/>
+        </w:rPr>
         <w:t xml:space="preserve">Anyone on internet can access via URL </w:t>
       </w:r>
     </w:p>
@@ -1372,16 +1868,28 @@
           <w:numId w:val="7"/>
         </w:numPr>
         <w:jc w:val="both"/>
-      </w:pPr>
-      <w:r>
+        <w:rPr>
+          <w:rFonts w:ascii="Times New Roman" w:hAnsi="Times New Roman" w:cs="Times New Roman"/>
+        </w:rPr>
+      </w:pPr>
+      <w:r>
+        <w:rPr>
+          <w:rFonts w:ascii="Times New Roman" w:hAnsi="Times New Roman" w:cs="Times New Roman"/>
+        </w:rPr>
         <w:t xml:space="preserve">Example: </w:t>
       </w:r>
     </w:p>
     <w:p>
       <w:pPr>
         <w:jc w:val="both"/>
-      </w:pPr>
-      <w:r>
+        <w:rPr>
+          <w:rFonts w:ascii="Times New Roman" w:hAnsi="Times New Roman" w:cs="Times New Roman"/>
+        </w:rPr>
+      </w:pPr>
+      <w:r>
+        <w:rPr>
+          <w:rFonts w:ascii="Times New Roman" w:hAnsi="Times New Roman" w:cs="Times New Roman"/>
+        </w:rPr>
         <w:t>https://my-bucket.s3.amazonaws.com/image.jpg</w:t>
       </w:r>
     </w:p>
@@ -1389,12 +1897,14 @@
       <w:pPr>
         <w:jc w:val="both"/>
         <w:rPr>
-          <w:b/>
-          <w:bCs/>
-        </w:rPr>
-      </w:pPr>
-      <w:r>
-        <w:rPr>
+          <w:rFonts w:ascii="Times New Roman" w:hAnsi="Times New Roman" w:cs="Times New Roman"/>
+          <w:b/>
+          <w:bCs/>
+        </w:rPr>
+      </w:pPr>
+      <w:r>
+        <w:rPr>
+          <w:rFonts w:ascii="Times New Roman" w:hAnsi="Times New Roman" w:cs="Times New Roman"/>
           <w:b/>
           <w:bCs/>
         </w:rPr>
@@ -1408,14 +1918,23 @@
           <w:numId w:val="8"/>
         </w:numPr>
         <w:jc w:val="both"/>
-      </w:pPr>
-      <w:r>
+        <w:rPr>
+          <w:rFonts w:ascii="Times New Roman" w:hAnsi="Times New Roman" w:cs="Times New Roman"/>
+        </w:rPr>
+      </w:pPr>
+      <w:r>
+        <w:rPr>
+          <w:rFonts w:ascii="Times New Roman" w:hAnsi="Times New Roman" w:cs="Times New Roman"/>
+        </w:rPr>
         <w:t xml:space="preserve">Bucket policy OR object ACL </w:t>
       </w:r>
     </w:p>
     <w:p>
       <w:pPr>
         <w:jc w:val="both"/>
+        <w:rPr>
+          <w:rFonts w:ascii="Times New Roman" w:hAnsi="Times New Roman" w:cs="Times New Roman"/>
+        </w:rPr>
       </w:pPr>
       <w:r>
         <w:rPr>
@@ -1424,6 +1943,9 @@
         <w:t>⚠️</w:t>
       </w:r>
       <w:r>
+        <w:rPr>
+          <w:rFonts w:ascii="Times New Roman" w:hAnsi="Times New Roman" w:cs="Times New Roman"/>
+        </w:rPr>
         <w:t xml:space="preserve"> Risk:</w:t>
       </w:r>
     </w:p>
@@ -1434,16 +1956,28 @@
           <w:numId w:val="9"/>
         </w:numPr>
         <w:jc w:val="both"/>
-      </w:pPr>
-      <w:r>
+        <w:rPr>
+          <w:rFonts w:ascii="Times New Roman" w:hAnsi="Times New Roman" w:cs="Times New Roman"/>
+        </w:rPr>
+      </w:pPr>
+      <w:r>
+        <w:rPr>
+          <w:rFonts w:ascii="Times New Roman" w:hAnsi="Times New Roman" w:cs="Times New Roman"/>
+        </w:rPr>
         <w:t xml:space="preserve">Data leak if misconfigured (very common in real-world incidents) </w:t>
       </w:r>
     </w:p>
     <w:p>
       <w:pPr>
         <w:jc w:val="both"/>
-      </w:pPr>
-      <w:r>
+        <w:rPr>
+          <w:rFonts w:ascii="Times New Roman" w:hAnsi="Times New Roman" w:cs="Times New Roman"/>
+        </w:rPr>
+      </w:pPr>
+      <w:r>
+        <w:rPr>
+          <w:rFonts w:ascii="Times New Roman" w:hAnsi="Times New Roman" w:cs="Times New Roman"/>
+        </w:rPr>
         <w:pict w14:anchorId="0B3572E9">
           <v:rect id="_x0000_i1026" style="width:0;height:1.5pt" o:hralign="center" o:hrstd="t" o:hr="t" fillcolor="#a0a0a0" stroked="f"/>
         </w:pict>
@@ -1453,6 +1987,7 @@
       <w:pPr>
         <w:jc w:val="both"/>
         <w:rPr>
+          <w:rFonts w:ascii="Times New Roman" w:hAnsi="Times New Roman" w:cs="Times New Roman"/>
           <w:b/>
           <w:bCs/>
         </w:rPr>
@@ -1467,6 +2002,7 @@
       </w:r>
       <w:r>
         <w:rPr>
+          <w:rFonts w:ascii="Times New Roman" w:hAnsi="Times New Roman" w:cs="Times New Roman"/>
           <w:b/>
           <w:bCs/>
         </w:rPr>
@@ -1480,18 +2016,28 @@
           <w:numId w:val="10"/>
         </w:numPr>
         <w:jc w:val="both"/>
-      </w:pPr>
-      <w:r>
+        <w:rPr>
+          <w:rFonts w:ascii="Times New Roman" w:hAnsi="Times New Roman" w:cs="Times New Roman"/>
+        </w:rPr>
+      </w:pPr>
+      <w:r>
+        <w:rPr>
+          <w:rFonts w:ascii="Times New Roman" w:hAnsi="Times New Roman" w:cs="Times New Roman"/>
+        </w:rPr>
         <w:t xml:space="preserve">Keep bucket </w:t>
       </w:r>
       <w:r>
         <w:rPr>
+          <w:rFonts w:ascii="Times New Roman" w:hAnsi="Times New Roman" w:cs="Times New Roman"/>
           <w:b/>
           <w:bCs/>
         </w:rPr>
         <w:t>private</w:t>
       </w:r>
       <w:r>
+        <w:rPr>
+          <w:rFonts w:ascii="Times New Roman" w:hAnsi="Times New Roman" w:cs="Times New Roman"/>
+        </w:rPr>
         <w:t xml:space="preserve"> </w:t>
       </w:r>
     </w:p>
@@ -1502,84 +2048,139 @@
           <w:numId w:val="10"/>
         </w:numPr>
         <w:jc w:val="both"/>
-      </w:pPr>
-      <w:r>
+        <w:rPr>
+          <w:rFonts w:ascii="Times New Roman" w:hAnsi="Times New Roman" w:cs="Times New Roman"/>
+        </w:rPr>
+      </w:pPr>
+      <w:r>
+        <w:rPr>
+          <w:rFonts w:ascii="Times New Roman" w:hAnsi="Times New Roman" w:cs="Times New Roman"/>
+        </w:rPr>
         <w:t xml:space="preserve">Use </w:t>
       </w:r>
       <w:r>
         <w:rPr>
+          <w:rFonts w:ascii="Times New Roman" w:hAnsi="Times New Roman" w:cs="Times New Roman"/>
           <w:b/>
           <w:bCs/>
         </w:rPr>
         <w:t>pre-signed URLs</w:t>
       </w:r>
       <w:r>
+        <w:rPr>
+          <w:rFonts w:ascii="Times New Roman" w:hAnsi="Times New Roman" w:cs="Times New Roman"/>
+        </w:rPr>
         <w:t xml:space="preserve"> for temporary access</w:t>
       </w:r>
     </w:p>
     <w:p>
       <w:pPr>
         <w:jc w:val="both"/>
-      </w:pPr>
-    </w:p>
-    <w:p>
-      <w:pPr>
-        <w:jc w:val="both"/>
-      </w:pPr>
-    </w:p>
-    <w:p>
-      <w:pPr>
-        <w:jc w:val="both"/>
-      </w:pPr>
-    </w:p>
-    <w:p>
-      <w:pPr>
-        <w:jc w:val="both"/>
-      </w:pPr>
-    </w:p>
-    <w:p>
-      <w:pPr>
-        <w:jc w:val="both"/>
-      </w:pPr>
-    </w:p>
-    <w:p>
-      <w:pPr>
-        <w:jc w:val="both"/>
-      </w:pPr>
-    </w:p>
-    <w:p>
-      <w:pPr>
-        <w:jc w:val="both"/>
-        <w:rPr>
-          <w:b/>
-          <w:bCs/>
-        </w:rPr>
-      </w:pPr>
-      <w:r>
-        <w:rPr>
-          <w:b/>
-          <w:bCs/>
-        </w:rPr>
-        <w:t>Common Use Cases</w:t>
-      </w:r>
-      <w:r>
-        <w:rPr>
-          <w:b/>
-          <w:bCs/>
-        </w:rPr>
-        <w:t>:</w:t>
-      </w:r>
-    </w:p>
-    <w:p>
-      <w:pPr>
-        <w:jc w:val="both"/>
-        <w:rPr>
-          <w:b/>
-          <w:bCs/>
-        </w:rPr>
-      </w:pPr>
-      <w:r>
-        <w:rPr>
+        <w:rPr>
+          <w:rFonts w:ascii="Times New Roman" w:hAnsi="Times New Roman" w:cs="Times New Roman"/>
+        </w:rPr>
+      </w:pPr>
+    </w:p>
+    <w:p>
+      <w:pPr>
+        <w:jc w:val="both"/>
+        <w:rPr>
+          <w:rFonts w:ascii="Times New Roman" w:hAnsi="Times New Roman" w:cs="Times New Roman"/>
+        </w:rPr>
+      </w:pPr>
+    </w:p>
+    <w:p>
+      <w:pPr>
+        <w:jc w:val="both"/>
+        <w:rPr>
+          <w:rFonts w:ascii="Times New Roman" w:hAnsi="Times New Roman" w:cs="Times New Roman"/>
+        </w:rPr>
+      </w:pPr>
+    </w:p>
+    <w:p>
+      <w:pPr>
+        <w:jc w:val="both"/>
+        <w:rPr>
+          <w:rFonts w:ascii="Times New Roman" w:hAnsi="Times New Roman" w:cs="Times New Roman"/>
+        </w:rPr>
+      </w:pPr>
+    </w:p>
+    <w:p>
+      <w:pPr>
+        <w:jc w:val="both"/>
+        <w:rPr>
+          <w:rFonts w:ascii="Times New Roman" w:hAnsi="Times New Roman" w:cs="Times New Roman"/>
+        </w:rPr>
+      </w:pPr>
+    </w:p>
+    <w:p>
+      <w:pPr>
+        <w:jc w:val="both"/>
+        <w:rPr>
+          <w:rFonts w:ascii="Times New Roman" w:hAnsi="Times New Roman" w:cs="Times New Roman"/>
+        </w:rPr>
+      </w:pPr>
+    </w:p>
+    <w:p>
+      <w:pPr>
+        <w:jc w:val="both"/>
+        <w:rPr>
+          <w:rFonts w:ascii="Times New Roman" w:hAnsi="Times New Roman" w:cs="Times New Roman"/>
+          <w:b/>
+          <w:bCs/>
+        </w:rPr>
+      </w:pPr>
+    </w:p>
+    <w:p>
+      <w:pPr>
+        <w:jc w:val="both"/>
+        <w:rPr>
+          <w:rFonts w:ascii="Times New Roman" w:hAnsi="Times New Roman" w:cs="Times New Roman"/>
+          <w:b/>
+          <w:bCs/>
+        </w:rPr>
+      </w:pPr>
+    </w:p>
+    <w:p>
+      <w:pPr>
+        <w:jc w:val="both"/>
+        <w:rPr>
+          <w:rFonts w:ascii="Times New Roman" w:hAnsi="Times New Roman" w:cs="Times New Roman"/>
+          <w:b/>
+          <w:bCs/>
+        </w:rPr>
+      </w:pPr>
+    </w:p>
+    <w:p>
+      <w:pPr>
+        <w:jc w:val="both"/>
+        <w:rPr>
+          <w:rFonts w:ascii="Times New Roman" w:hAnsi="Times New Roman" w:cs="Times New Roman"/>
+          <w:b/>
+          <w:bCs/>
+        </w:rPr>
+      </w:pPr>
+      <w:r>
+        <w:rPr>
+          <w:rFonts w:ascii="Times New Roman" w:hAnsi="Times New Roman" w:cs="Times New Roman"/>
+          <w:b/>
+          <w:bCs/>
+        </w:rPr>
+        <w:t>Common Use Cases:</w:t>
+      </w:r>
+    </w:p>
+    <w:p>
+      <w:pPr>
+        <w:jc w:val="both"/>
+        <w:rPr>
+          <w:rFonts w:ascii="Times New Roman" w:hAnsi="Times New Roman" w:cs="Times New Roman"/>
+          <w:b/>
+          <w:bCs/>
+        </w:rPr>
+      </w:pPr>
+      <w:r>
+        <w:rPr>
+          <w:rFonts w:ascii="Times New Roman" w:hAnsi="Times New Roman" w:cs="Times New Roman"/>
           <w:b/>
           <w:bCs/>
         </w:rPr>
@@ -1595,6 +2196,7 @@
       </w:r>
       <w:r>
         <w:rPr>
+          <w:rFonts w:ascii="Times New Roman" w:hAnsi="Times New Roman" w:cs="Times New Roman"/>
           <w:b/>
           <w:bCs/>
         </w:rPr>
@@ -1608,8 +2210,14 @@
           <w:numId w:val="11"/>
         </w:numPr>
         <w:jc w:val="both"/>
-      </w:pPr>
-      <w:r>
+        <w:rPr>
+          <w:rFonts w:ascii="Times New Roman" w:hAnsi="Times New Roman" w:cs="Times New Roman"/>
+        </w:rPr>
+      </w:pPr>
+      <w:r>
+        <w:rPr>
+          <w:rFonts w:ascii="Times New Roman" w:hAnsi="Times New Roman" w:cs="Times New Roman"/>
+        </w:rPr>
         <w:t xml:space="preserve">Profile pictures </w:t>
       </w:r>
     </w:p>
@@ -1620,8 +2228,14 @@
           <w:numId w:val="11"/>
         </w:numPr>
         <w:jc w:val="both"/>
-      </w:pPr>
-      <w:r>
+        <w:rPr>
+          <w:rFonts w:ascii="Times New Roman" w:hAnsi="Times New Roman" w:cs="Times New Roman"/>
+        </w:rPr>
+      </w:pPr>
+      <w:r>
+        <w:rPr>
+          <w:rFonts w:ascii="Times New Roman" w:hAnsi="Times New Roman" w:cs="Times New Roman"/>
+        </w:rPr>
         <w:t xml:space="preserve">Website assets </w:t>
       </w:r>
     </w:p>
@@ -1632,26 +2246,42 @@
           <w:numId w:val="11"/>
         </w:numPr>
         <w:jc w:val="both"/>
-      </w:pPr>
-      <w:r>
+        <w:rPr>
+          <w:rFonts w:ascii="Times New Roman" w:hAnsi="Times New Roman" w:cs="Times New Roman"/>
+        </w:rPr>
+      </w:pPr>
+      <w:r>
+        <w:rPr>
+          <w:rFonts w:ascii="Times New Roman" w:hAnsi="Times New Roman" w:cs="Times New Roman"/>
+        </w:rPr>
         <w:t xml:space="preserve">CDN integration (via </w:t>
       </w:r>
       <w:r>
         <w:rPr>
+          <w:rFonts w:ascii="Times New Roman" w:hAnsi="Times New Roman" w:cs="Times New Roman"/>
           <w:b/>
           <w:bCs/>
         </w:rPr>
         <w:t>Amazon CloudFront</w:t>
       </w:r>
       <w:r>
+        <w:rPr>
+          <w:rFonts w:ascii="Times New Roman" w:hAnsi="Times New Roman" w:cs="Times New Roman"/>
+        </w:rPr>
         <w:t xml:space="preserve">) </w:t>
       </w:r>
     </w:p>
     <w:p>
       <w:pPr>
         <w:jc w:val="both"/>
-      </w:pPr>
-      <w:r>
+        <w:rPr>
+          <w:rFonts w:ascii="Times New Roman" w:hAnsi="Times New Roman" w:cs="Times New Roman"/>
+        </w:rPr>
+      </w:pPr>
+      <w:r>
+        <w:rPr>
+          <w:rFonts w:ascii="Times New Roman" w:hAnsi="Times New Roman" w:cs="Times New Roman"/>
+        </w:rPr>
         <w:pict w14:anchorId="4EAF463E">
           <v:rect id="_x0000_i1027" style="width:0;height:1.5pt" o:hralign="center" o:hrstd="t" o:hr="t" fillcolor="#a0a0a0" stroked="f"/>
         </w:pict>
@@ -1661,12 +2291,14 @@
       <w:pPr>
         <w:jc w:val="both"/>
         <w:rPr>
-          <w:b/>
-          <w:bCs/>
-        </w:rPr>
-      </w:pPr>
-      <w:r>
-        <w:rPr>
+          <w:rFonts w:ascii="Times New Roman" w:hAnsi="Times New Roman" w:cs="Times New Roman"/>
+          <w:b/>
+          <w:bCs/>
+        </w:rPr>
+      </w:pPr>
+      <w:r>
+        <w:rPr>
+          <w:rFonts w:ascii="Times New Roman" w:hAnsi="Times New Roman" w:cs="Times New Roman"/>
           <w:b/>
           <w:bCs/>
         </w:rPr>
@@ -1682,6 +2314,7 @@
       </w:r>
       <w:r>
         <w:rPr>
+          <w:rFonts w:ascii="Times New Roman" w:hAnsi="Times New Roman" w:cs="Times New Roman"/>
           <w:b/>
           <w:bCs/>
         </w:rPr>
@@ -1695,8 +2328,14 @@
           <w:numId w:val="12"/>
         </w:numPr>
         <w:jc w:val="both"/>
-      </w:pPr>
-      <w:r>
+        <w:rPr>
+          <w:rFonts w:ascii="Times New Roman" w:hAnsi="Times New Roman" w:cs="Times New Roman"/>
+        </w:rPr>
+      </w:pPr>
+      <w:r>
+        <w:rPr>
+          <w:rFonts w:ascii="Times New Roman" w:hAnsi="Times New Roman" w:cs="Times New Roman"/>
+        </w:rPr>
         <w:t xml:space="preserve">Database backups </w:t>
       </w:r>
     </w:p>
@@ -1707,8 +2346,14 @@
           <w:numId w:val="12"/>
         </w:numPr>
         <w:jc w:val="both"/>
-      </w:pPr>
-      <w:r>
+        <w:rPr>
+          <w:rFonts w:ascii="Times New Roman" w:hAnsi="Times New Roman" w:cs="Times New Roman"/>
+        </w:rPr>
+      </w:pPr>
+      <w:r>
+        <w:rPr>
+          <w:rFonts w:ascii="Times New Roman" w:hAnsi="Times New Roman" w:cs="Times New Roman"/>
+        </w:rPr>
         <w:t xml:space="preserve">Logs </w:t>
       </w:r>
     </w:p>
@@ -1719,16 +2364,28 @@
           <w:numId w:val="12"/>
         </w:numPr>
         <w:jc w:val="both"/>
-      </w:pPr>
-      <w:r>
+        <w:rPr>
+          <w:rFonts w:ascii="Times New Roman" w:hAnsi="Times New Roman" w:cs="Times New Roman"/>
+        </w:rPr>
+      </w:pPr>
+      <w:r>
+        <w:rPr>
+          <w:rFonts w:ascii="Times New Roman" w:hAnsi="Times New Roman" w:cs="Times New Roman"/>
+        </w:rPr>
         <w:t xml:space="preserve">Versioning support </w:t>
       </w:r>
     </w:p>
     <w:p>
       <w:pPr>
         <w:jc w:val="both"/>
-      </w:pPr>
-      <w:r>
+        <w:rPr>
+          <w:rFonts w:ascii="Times New Roman" w:hAnsi="Times New Roman" w:cs="Times New Roman"/>
+        </w:rPr>
+      </w:pPr>
+      <w:r>
+        <w:rPr>
+          <w:rFonts w:ascii="Times New Roman" w:hAnsi="Times New Roman" w:cs="Times New Roman"/>
+        </w:rPr>
         <w:pict w14:anchorId="35269E80">
           <v:rect id="_x0000_i1028" style="width:0;height:1.5pt" o:hralign="center" o:hrstd="t" o:hr="t" fillcolor="#a0a0a0" stroked="f"/>
         </w:pict>
@@ -1738,12 +2395,14 @@
       <w:pPr>
         <w:jc w:val="both"/>
         <w:rPr>
-          <w:b/>
-          <w:bCs/>
-        </w:rPr>
-      </w:pPr>
-      <w:r>
-        <w:rPr>
+          <w:rFonts w:ascii="Times New Roman" w:hAnsi="Times New Roman" w:cs="Times New Roman"/>
+          <w:b/>
+          <w:bCs/>
+        </w:rPr>
+      </w:pPr>
+      <w:r>
+        <w:rPr>
+          <w:rFonts w:ascii="Times New Roman" w:hAnsi="Times New Roman" w:cs="Times New Roman"/>
           <w:b/>
           <w:bCs/>
         </w:rPr>
@@ -1759,6 +2418,7 @@
       </w:r>
       <w:r>
         <w:rPr>
+          <w:rFonts w:ascii="Times New Roman" w:hAnsi="Times New Roman" w:cs="Times New Roman"/>
           <w:b/>
           <w:bCs/>
         </w:rPr>
@@ -1772,8 +2432,14 @@
           <w:numId w:val="13"/>
         </w:numPr>
         <w:jc w:val="both"/>
-      </w:pPr>
-      <w:r>
+        <w:rPr>
+          <w:rFonts w:ascii="Times New Roman" w:hAnsi="Times New Roman" w:cs="Times New Roman"/>
+        </w:rPr>
+      </w:pPr>
+      <w:r>
+        <w:rPr>
+          <w:rFonts w:ascii="Times New Roman" w:hAnsi="Times New Roman" w:cs="Times New Roman"/>
+        </w:rPr>
         <w:t xml:space="preserve">Store large datasets </w:t>
       </w:r>
     </w:p>
@@ -1784,26 +2450,42 @@
           <w:numId w:val="13"/>
         </w:numPr>
         <w:jc w:val="both"/>
-      </w:pPr>
-      <w:r>
+        <w:rPr>
+          <w:rFonts w:ascii="Times New Roman" w:hAnsi="Times New Roman" w:cs="Times New Roman"/>
+        </w:rPr>
+      </w:pPr>
+      <w:r>
+        <w:rPr>
+          <w:rFonts w:ascii="Times New Roman" w:hAnsi="Times New Roman" w:cs="Times New Roman"/>
+        </w:rPr>
         <w:t xml:space="preserve">Used with tools like </w:t>
       </w:r>
       <w:r>
         <w:rPr>
+          <w:rFonts w:ascii="Times New Roman" w:hAnsi="Times New Roman" w:cs="Times New Roman"/>
           <w:b/>
           <w:bCs/>
         </w:rPr>
         <w:t>Amazon Athena</w:t>
       </w:r>
       <w:r>
+        <w:rPr>
+          <w:rFonts w:ascii="Times New Roman" w:hAnsi="Times New Roman" w:cs="Times New Roman"/>
+        </w:rPr>
         <w:t xml:space="preserve"> </w:t>
       </w:r>
     </w:p>
     <w:p>
       <w:pPr>
         <w:jc w:val="both"/>
-      </w:pPr>
-      <w:r>
+        <w:rPr>
+          <w:rFonts w:ascii="Times New Roman" w:hAnsi="Times New Roman" w:cs="Times New Roman"/>
+        </w:rPr>
+      </w:pPr>
+      <w:r>
+        <w:rPr>
+          <w:rFonts w:ascii="Times New Roman" w:hAnsi="Times New Roman" w:cs="Times New Roman"/>
+        </w:rPr>
         <w:pict w14:anchorId="259B7682">
           <v:rect id="_x0000_i1029" style="width:0;height:1.5pt" o:hralign="center" o:hrstd="t" o:hr="t" fillcolor="#a0a0a0" stroked="f"/>
         </w:pict>
@@ -1813,12 +2495,14 @@
       <w:pPr>
         <w:jc w:val="both"/>
         <w:rPr>
-          <w:b/>
-          <w:bCs/>
-        </w:rPr>
-      </w:pPr>
-      <w:r>
-        <w:rPr>
+          <w:rFonts w:ascii="Times New Roman" w:hAnsi="Times New Roman" w:cs="Times New Roman"/>
+          <w:b/>
+          <w:bCs/>
+        </w:rPr>
+      </w:pPr>
+      <w:r>
+        <w:rPr>
+          <w:rFonts w:ascii="Times New Roman" w:hAnsi="Times New Roman" w:cs="Times New Roman"/>
           <w:b/>
           <w:bCs/>
         </w:rPr>
@@ -1834,6 +2518,7 @@
       </w:r>
       <w:r>
         <w:rPr>
+          <w:rFonts w:ascii="Times New Roman" w:hAnsi="Times New Roman" w:cs="Times New Roman"/>
           <w:b/>
           <w:bCs/>
         </w:rPr>
@@ -1847,8 +2532,14 @@
           <w:numId w:val="14"/>
         </w:numPr>
         <w:jc w:val="both"/>
-      </w:pPr>
-      <w:r>
+        <w:rPr>
+          <w:rFonts w:ascii="Times New Roman" w:hAnsi="Times New Roman" w:cs="Times New Roman"/>
+        </w:rPr>
+      </w:pPr>
+      <w:r>
+        <w:rPr>
+          <w:rFonts w:ascii="Times New Roman" w:hAnsi="Times New Roman" w:cs="Times New Roman"/>
+        </w:rPr>
         <w:t xml:space="preserve">Upload files from frontend → store in S3 </w:t>
       </w:r>
     </w:p>
@@ -1859,8 +2550,14 @@
           <w:numId w:val="14"/>
         </w:numPr>
         <w:jc w:val="both"/>
-      </w:pPr>
-      <w:r>
+        <w:rPr>
+          <w:rFonts w:ascii="Times New Roman" w:hAnsi="Times New Roman" w:cs="Times New Roman"/>
+        </w:rPr>
+      </w:pPr>
+      <w:r>
+        <w:rPr>
+          <w:rFonts w:ascii="Times New Roman" w:hAnsi="Times New Roman" w:cs="Times New Roman"/>
+        </w:rPr>
         <w:t xml:space="preserve">Common in: </w:t>
       </w:r>
     </w:p>
@@ -1871,8 +2568,14 @@
           <w:numId w:val="14"/>
         </w:numPr>
         <w:jc w:val="both"/>
-      </w:pPr>
-      <w:r>
+        <w:rPr>
+          <w:rFonts w:ascii="Times New Roman" w:hAnsi="Times New Roman" w:cs="Times New Roman"/>
+        </w:rPr>
+      </w:pPr>
+      <w:r>
+        <w:rPr>
+          <w:rFonts w:ascii="Times New Roman" w:hAnsi="Times New Roman" w:cs="Times New Roman"/>
+        </w:rPr>
         <w:t xml:space="preserve">Resume upload </w:t>
       </w:r>
     </w:p>
@@ -1883,8 +2586,14 @@
           <w:numId w:val="14"/>
         </w:numPr>
         <w:jc w:val="both"/>
-      </w:pPr>
-      <w:r>
+        <w:rPr>
+          <w:rFonts w:ascii="Times New Roman" w:hAnsi="Times New Roman" w:cs="Times New Roman"/>
+        </w:rPr>
+      </w:pPr>
+      <w:r>
+        <w:rPr>
+          <w:rFonts w:ascii="Times New Roman" w:hAnsi="Times New Roman" w:cs="Times New Roman"/>
+        </w:rPr>
         <w:t xml:space="preserve">Documents </w:t>
       </w:r>
     </w:p>
@@ -1895,26 +2604,37 @@
           <w:numId w:val="14"/>
         </w:numPr>
         <w:jc w:val="both"/>
-      </w:pPr>
-      <w:r>
+        <w:rPr>
+          <w:rFonts w:ascii="Times New Roman" w:hAnsi="Times New Roman" w:cs="Times New Roman"/>
+        </w:rPr>
+      </w:pPr>
+      <w:r>
+        <w:rPr>
+          <w:rFonts w:ascii="Times New Roman" w:hAnsi="Times New Roman" w:cs="Times New Roman"/>
+        </w:rPr>
         <w:t>Media apps</w:t>
       </w:r>
     </w:p>
     <w:p>
       <w:pPr>
         <w:jc w:val="both"/>
-      </w:pPr>
-    </w:p>
-    <w:p>
-      <w:pPr>
-        <w:jc w:val="both"/>
-        <w:rPr>
-          <w:b/>
-          <w:bCs/>
-        </w:rPr>
-      </w:pPr>
-      <w:r>
-        <w:rPr>
+        <w:rPr>
+          <w:rFonts w:ascii="Times New Roman" w:hAnsi="Times New Roman" w:cs="Times New Roman"/>
+        </w:rPr>
+      </w:pPr>
+    </w:p>
+    <w:p>
+      <w:pPr>
+        <w:jc w:val="both"/>
+        <w:rPr>
+          <w:rFonts w:ascii="Times New Roman" w:hAnsi="Times New Roman" w:cs="Times New Roman"/>
+          <w:b/>
+          <w:bCs/>
+        </w:rPr>
+      </w:pPr>
+      <w:r>
+        <w:rPr>
+          <w:rFonts w:ascii="Times New Roman" w:hAnsi="Times New Roman" w:cs="Times New Roman"/>
           <w:b/>
           <w:bCs/>
         </w:rPr>
@@ -1924,8 +2644,14 @@
     <w:p>
       <w:pPr>
         <w:jc w:val="both"/>
-      </w:pPr>
-      <w:r>
+        <w:rPr>
+          <w:rFonts w:ascii="Times New Roman" w:hAnsi="Times New Roman" w:cs="Times New Roman"/>
+        </w:rPr>
+      </w:pPr>
+      <w:r>
+        <w:rPr>
+          <w:rFonts w:ascii="Times New Roman" w:hAnsi="Times New Roman" w:cs="Times New Roman"/>
+        </w:rPr>
         <w:t>In your Spring Boot app:</w:t>
       </w:r>
     </w:p>
@@ -1936,8 +2662,14 @@
           <w:numId w:val="15"/>
         </w:numPr>
         <w:jc w:val="both"/>
-      </w:pPr>
-      <w:r>
+        <w:rPr>
+          <w:rFonts w:ascii="Times New Roman" w:hAnsi="Times New Roman" w:cs="Times New Roman"/>
+        </w:rPr>
+      </w:pPr>
+      <w:r>
+        <w:rPr>
+          <w:rFonts w:ascii="Times New Roman" w:hAnsi="Times New Roman" w:cs="Times New Roman"/>
+        </w:rPr>
         <w:t xml:space="preserve">User uploads profile image </w:t>
       </w:r>
     </w:p>
@@ -1948,18 +2680,28 @@
           <w:numId w:val="15"/>
         </w:numPr>
         <w:jc w:val="both"/>
-      </w:pPr>
-      <w:r>
+        <w:rPr>
+          <w:rFonts w:ascii="Times New Roman" w:hAnsi="Times New Roman" w:cs="Times New Roman"/>
+        </w:rPr>
+      </w:pPr>
+      <w:r>
+        <w:rPr>
+          <w:rFonts w:ascii="Times New Roman" w:hAnsi="Times New Roman" w:cs="Times New Roman"/>
+        </w:rPr>
         <w:t xml:space="preserve">Backend generates </w:t>
       </w:r>
       <w:r>
         <w:rPr>
+          <w:rFonts w:ascii="Times New Roman" w:hAnsi="Times New Roman" w:cs="Times New Roman"/>
           <w:b/>
           <w:bCs/>
         </w:rPr>
         <w:t>pre-signed URL</w:t>
       </w:r>
       <w:r>
+        <w:rPr>
+          <w:rFonts w:ascii="Times New Roman" w:hAnsi="Times New Roman" w:cs="Times New Roman"/>
+        </w:rPr>
         <w:t xml:space="preserve"> </w:t>
       </w:r>
     </w:p>
@@ -1970,9 +2712,14 @@
           <w:numId w:val="15"/>
         </w:numPr>
         <w:jc w:val="both"/>
-      </w:pPr>
-      <w:r>
-        <w:lastRenderedPageBreak/>
+        <w:rPr>
+          <w:rFonts w:ascii="Times New Roman" w:hAnsi="Times New Roman" w:cs="Times New Roman"/>
+        </w:rPr>
+      </w:pPr>
+      <w:r>
+        <w:rPr>
+          <w:rFonts w:ascii="Times New Roman" w:hAnsi="Times New Roman" w:cs="Times New Roman"/>
+        </w:rPr>
         <w:t xml:space="preserve">Frontend uploads directly to S3 </w:t>
       </w:r>
     </w:p>
@@ -1983,22 +2730,35 @@
           <w:numId w:val="15"/>
         </w:numPr>
         <w:jc w:val="both"/>
-      </w:pPr>
-      <w:r>
+        <w:rPr>
+          <w:rFonts w:ascii="Times New Roman" w:hAnsi="Times New Roman" w:cs="Times New Roman"/>
+        </w:rPr>
+      </w:pPr>
+      <w:r>
+        <w:rPr>
+          <w:rFonts w:ascii="Times New Roman" w:hAnsi="Times New Roman" w:cs="Times New Roman"/>
+        </w:rPr>
         <w:t xml:space="preserve">Store S3 URL in DB </w:t>
       </w:r>
     </w:p>
     <w:p>
       <w:pPr>
         <w:jc w:val="both"/>
+        <w:rPr>
+          <w:rFonts w:ascii="Times New Roman" w:hAnsi="Times New Roman" w:cs="Times New Roman"/>
+        </w:rPr>
       </w:pPr>
       <w:r>
         <w:rPr>
           <w:rFonts w:ascii="Segoe UI Emoji" w:hAnsi="Segoe UI Emoji" w:cs="Segoe UI Emoji"/>
         </w:rPr>
+        <w:lastRenderedPageBreak/>
         <w:t>👉</w:t>
       </w:r>
       <w:r>
+        <w:rPr>
+          <w:rFonts w:ascii="Times New Roman" w:hAnsi="Times New Roman" w:cs="Times New Roman"/>
+        </w:rPr>
         <w:t xml:space="preserve"> This avoids:</w:t>
       </w:r>
     </w:p>
@@ -2009,8 +2769,14 @@
           <w:numId w:val="16"/>
         </w:numPr>
         <w:jc w:val="both"/>
-      </w:pPr>
-      <w:r>
+        <w:rPr>
+          <w:rFonts w:ascii="Times New Roman" w:hAnsi="Times New Roman" w:cs="Times New Roman"/>
+        </w:rPr>
+      </w:pPr>
+      <w:r>
+        <w:rPr>
+          <w:rFonts w:ascii="Times New Roman" w:hAnsi="Times New Roman" w:cs="Times New Roman"/>
+        </w:rPr>
         <w:t xml:space="preserve">Overloading backend </w:t>
       </w:r>
     </w:p>
@@ -2021,26 +2787,37 @@
           <w:numId w:val="16"/>
         </w:numPr>
         <w:jc w:val="both"/>
-      </w:pPr>
-      <w:r>
+        <w:rPr>
+          <w:rFonts w:ascii="Times New Roman" w:hAnsi="Times New Roman" w:cs="Times New Roman"/>
+        </w:rPr>
+      </w:pPr>
+      <w:r>
+        <w:rPr>
+          <w:rFonts w:ascii="Times New Roman" w:hAnsi="Times New Roman" w:cs="Times New Roman"/>
+        </w:rPr>
         <w:t>Handling large files in server memory</w:t>
       </w:r>
     </w:p>
     <w:p>
       <w:pPr>
         <w:jc w:val="both"/>
-      </w:pPr>
-    </w:p>
-    <w:p>
-      <w:pPr>
-        <w:jc w:val="both"/>
-        <w:rPr>
-          <w:b/>
-          <w:bCs/>
-        </w:rPr>
-      </w:pPr>
-      <w:r>
-        <w:rPr>
+        <w:rPr>
+          <w:rFonts w:ascii="Times New Roman" w:hAnsi="Times New Roman" w:cs="Times New Roman"/>
+        </w:rPr>
+      </w:pPr>
+    </w:p>
+    <w:p>
+      <w:pPr>
+        <w:jc w:val="both"/>
+        <w:rPr>
+          <w:rFonts w:ascii="Times New Roman" w:hAnsi="Times New Roman" w:cs="Times New Roman"/>
+          <w:b/>
+          <w:bCs/>
+        </w:rPr>
+      </w:pPr>
+      <w:r>
+        <w:rPr>
+          <w:rFonts w:ascii="Times New Roman" w:hAnsi="Times New Roman" w:cs="Times New Roman"/>
           <w:b/>
           <w:bCs/>
         </w:rPr>
@@ -2054,8 +2831,14 @@
           <w:numId w:val="17"/>
         </w:numPr>
         <w:jc w:val="both"/>
-      </w:pPr>
-      <w:r>
+        <w:rPr>
+          <w:rFonts w:ascii="Times New Roman" w:hAnsi="Times New Roman" w:cs="Times New Roman"/>
+        </w:rPr>
+      </w:pPr>
+      <w:r>
+        <w:rPr>
+          <w:rFonts w:ascii="Times New Roman" w:hAnsi="Times New Roman" w:cs="Times New Roman"/>
+        </w:rPr>
         <w:t xml:space="preserve">Bucket = container </w:t>
       </w:r>
     </w:p>
@@ -2066,8 +2849,14 @@
           <w:numId w:val="17"/>
         </w:numPr>
         <w:jc w:val="both"/>
-      </w:pPr>
-      <w:r>
+        <w:rPr>
+          <w:rFonts w:ascii="Times New Roman" w:hAnsi="Times New Roman" w:cs="Times New Roman"/>
+        </w:rPr>
+      </w:pPr>
+      <w:r>
+        <w:rPr>
+          <w:rFonts w:ascii="Times New Roman" w:hAnsi="Times New Roman" w:cs="Times New Roman"/>
+        </w:rPr>
         <w:t xml:space="preserve">Object = file + metadata + key </w:t>
       </w:r>
     </w:p>
@@ -2078,8 +2867,14 @@
           <w:numId w:val="17"/>
         </w:numPr>
         <w:jc w:val="both"/>
-      </w:pPr>
-      <w:r>
+        <w:rPr>
+          <w:rFonts w:ascii="Times New Roman" w:hAnsi="Times New Roman" w:cs="Times New Roman"/>
+        </w:rPr>
+      </w:pPr>
+      <w:r>
+        <w:rPr>
+          <w:rFonts w:ascii="Times New Roman" w:hAnsi="Times New Roman" w:cs="Times New Roman"/>
+        </w:rPr>
         <w:t xml:space="preserve">S3 = object storage (not file system) </w:t>
       </w:r>
     </w:p>
@@ -2090,8 +2885,14 @@
           <w:numId w:val="17"/>
         </w:numPr>
         <w:jc w:val="both"/>
-      </w:pPr>
-      <w:r>
+        <w:rPr>
+          <w:rFonts w:ascii="Times New Roman" w:hAnsi="Times New Roman" w:cs="Times New Roman"/>
+        </w:rPr>
+      </w:pPr>
+      <w:r>
+        <w:rPr>
+          <w:rFonts w:ascii="Times New Roman" w:hAnsi="Times New Roman" w:cs="Times New Roman"/>
+        </w:rPr>
         <w:t xml:space="preserve">Default = private </w:t>
       </w:r>
     </w:p>
@@ -2102,8 +2903,14 @@
           <w:numId w:val="17"/>
         </w:numPr>
         <w:jc w:val="both"/>
-      </w:pPr>
-      <w:r>
+        <w:rPr>
+          <w:rFonts w:ascii="Times New Roman" w:hAnsi="Times New Roman" w:cs="Times New Roman"/>
+        </w:rPr>
+      </w:pPr>
+      <w:r>
+        <w:rPr>
+          <w:rFonts w:ascii="Times New Roman" w:hAnsi="Times New Roman" w:cs="Times New Roman"/>
+        </w:rPr>
         <w:t xml:space="preserve">Public = risky but useful for static content </w:t>
       </w:r>
     </w:p>
@@ -2114,31 +2921,45 @@
           <w:numId w:val="17"/>
         </w:numPr>
         <w:jc w:val="both"/>
-      </w:pPr>
-      <w:r>
+        <w:rPr>
+          <w:rFonts w:ascii="Times New Roman" w:hAnsi="Times New Roman" w:cs="Times New Roman"/>
+        </w:rPr>
+      </w:pPr>
+      <w:r>
+        <w:rPr>
+          <w:rFonts w:ascii="Times New Roman" w:hAnsi="Times New Roman" w:cs="Times New Roman"/>
+        </w:rPr>
         <w:t>Used for: images, backups, data lakes</w:t>
       </w:r>
     </w:p>
     <w:p>
       <w:pPr>
         <w:jc w:val="both"/>
-      </w:pPr>
-    </w:p>
-    <w:p>
-      <w:pPr>
-        <w:jc w:val="both"/>
-      </w:pPr>
-    </w:p>
-    <w:p>
-      <w:pPr>
-        <w:jc w:val="both"/>
-        <w:rPr>
-          <w:b/>
-          <w:bCs/>
-        </w:rPr>
-      </w:pPr>
-      <w:r>
-        <w:rPr>
+        <w:rPr>
+          <w:rFonts w:ascii="Times New Roman" w:hAnsi="Times New Roman" w:cs="Times New Roman"/>
+        </w:rPr>
+      </w:pPr>
+    </w:p>
+    <w:p>
+      <w:pPr>
+        <w:jc w:val="both"/>
+        <w:rPr>
+          <w:rFonts w:ascii="Times New Roman" w:hAnsi="Times New Roman" w:cs="Times New Roman"/>
+        </w:rPr>
+      </w:pPr>
+    </w:p>
+    <w:p>
+      <w:pPr>
+        <w:jc w:val="both"/>
+        <w:rPr>
+          <w:rFonts w:ascii="Times New Roman" w:hAnsi="Times New Roman" w:cs="Times New Roman"/>
+          <w:b/>
+          <w:bCs/>
+        </w:rPr>
+      </w:pPr>
+      <w:r>
+        <w:rPr>
+          <w:rFonts w:ascii="Times New Roman" w:hAnsi="Times New Roman" w:cs="Times New Roman"/>
           <w:b/>
           <w:bCs/>
           <w:highlight w:val="yellow"/>
@@ -2149,37 +2970,353 @@
     <w:p>
       <w:pPr>
         <w:jc w:val="both"/>
-      </w:pPr>
-      <w:r>
-        <w:t>What is IAM?</w:t>
-      </w:r>
-      <w:r>
-        <w:t xml:space="preserve"> </w:t>
-      </w:r>
-      <w:r>
-        <w:t>Users vs Roles vs Policies</w:t>
-      </w:r>
-      <w:r>
-        <w:t>.</w:t>
-      </w:r>
-    </w:p>
-    <w:p>
-      <w:pPr>
-        <w:jc w:val="both"/>
-      </w:pPr>
-      <w:r>
-        <w:t>Why IAM is critical for security</w:t>
-      </w:r>
-      <w:r>
-        <w:t>?</w:t>
-      </w:r>
-    </w:p>
-    <w:p>
-      <w:pPr>
-        <w:jc w:val="both"/>
-      </w:pPr>
-      <w:r>
-        <w:t>https://www.youtube.com/watch?v=c8p0kKEecbs</w:t>
+        <w:rPr>
+          <w:rFonts w:ascii="Times New Roman" w:hAnsi="Times New Roman" w:cs="Times New Roman"/>
+        </w:rPr>
+      </w:pPr>
+      <w:r>
+        <w:rPr>
+          <w:rFonts w:ascii="Times New Roman" w:hAnsi="Times New Roman" w:cs="Times New Roman"/>
+        </w:rPr>
+        <w:t>What is IAM? Users vs Roles vs Policies.</w:t>
+      </w:r>
+    </w:p>
+    <w:p>
+      <w:pPr>
+        <w:jc w:val="both"/>
+        <w:rPr>
+          <w:rFonts w:ascii="Times New Roman" w:hAnsi="Times New Roman" w:cs="Times New Roman"/>
+        </w:rPr>
+      </w:pPr>
+      <w:r>
+        <w:rPr>
+          <w:rFonts w:ascii="Times New Roman" w:hAnsi="Times New Roman" w:cs="Times New Roman"/>
+        </w:rPr>
+        <w:t>Why IAM is critical for security?</w:t>
+      </w:r>
+    </w:p>
+    <w:p>
+      <w:pPr>
+        <w:jc w:val="both"/>
+        <w:rPr>
+          <w:rFonts w:ascii="Times New Roman" w:hAnsi="Times New Roman" w:cs="Times New Roman"/>
+        </w:rPr>
+      </w:pPr>
+      <w:r>
+        <w:rPr>
+          <w:rFonts w:ascii="Times New Roman" w:hAnsi="Times New Roman" w:cs="Times New Roman"/>
+          <w:b/>
+          <w:bCs/>
+        </w:rPr>
+        <w:t>Source:</w:t>
+      </w:r>
+    </w:p>
+    <w:p>
+      <w:pPr>
+        <w:jc w:val="both"/>
+        <w:rPr>
+          <w:rFonts w:ascii="Times New Roman" w:hAnsi="Times New Roman" w:cs="Times New Roman"/>
+        </w:rPr>
+      </w:pPr>
+      <w:hyperlink r:id="rId6" w:history="1">
+        <w:r>
+          <w:rPr>
+            <w:rStyle w:val="Hyperlink"/>
+            <w:rFonts w:ascii="Times New Roman" w:hAnsi="Times New Roman" w:cs="Times New Roman"/>
+          </w:rPr>
+          <w:t>https://www.youtube.com/watch?v=c8p0kKEecbs</w:t>
+        </w:r>
+      </w:hyperlink>
+    </w:p>
+    <w:p>
+      <w:pPr>
+        <w:jc w:val="both"/>
+        <w:rPr>
+          <w:rFonts w:ascii="Times New Roman" w:hAnsi="Times New Roman" w:cs="Times New Roman"/>
+        </w:rPr>
+      </w:pPr>
+    </w:p>
+    <w:p>
+      <w:pPr>
+        <w:jc w:val="both"/>
+        <w:rPr>
+          <w:rFonts w:ascii="Times New Roman" w:hAnsi="Times New Roman" w:cs="Times New Roman"/>
+        </w:rPr>
+      </w:pPr>
+      <w:r>
+        <w:rPr>
+          <w:rFonts w:ascii="Times New Roman" w:hAnsi="Times New Roman" w:cs="Times New Roman"/>
+        </w:rPr>
+        <w:t>IAM</w:t>
+      </w:r>
+      <w:r>
+        <w:rPr>
+          <w:rFonts w:ascii="Times New Roman" w:hAnsi="Times New Roman" w:cs="Times New Roman"/>
+        </w:rPr>
+        <w:t xml:space="preserve"> = </w:t>
+      </w:r>
+      <w:r>
+        <w:rPr>
+          <w:rFonts w:ascii="Times New Roman" w:hAnsi="Times New Roman" w:cs="Times New Roman"/>
+        </w:rPr>
+        <w:t>I</w:t>
+      </w:r>
+      <w:r>
+        <w:rPr>
+          <w:rFonts w:ascii="Times New Roman" w:hAnsi="Times New Roman" w:cs="Times New Roman"/>
+        </w:rPr>
+        <w:t xml:space="preserve">dentity and </w:t>
+      </w:r>
+      <w:r>
+        <w:rPr>
+          <w:rFonts w:ascii="Times New Roman" w:hAnsi="Times New Roman" w:cs="Times New Roman"/>
+        </w:rPr>
+        <w:t>A</w:t>
+      </w:r>
+      <w:r>
+        <w:rPr>
+          <w:rFonts w:ascii="Times New Roman" w:hAnsi="Times New Roman" w:cs="Times New Roman"/>
+        </w:rPr>
+        <w:t xml:space="preserve">ccess </w:t>
+      </w:r>
+      <w:r>
+        <w:rPr>
+          <w:rFonts w:ascii="Times New Roman" w:hAnsi="Times New Roman" w:cs="Times New Roman"/>
+        </w:rPr>
+        <w:t>M</w:t>
+      </w:r>
+      <w:r>
+        <w:rPr>
+          <w:rFonts w:ascii="Times New Roman" w:hAnsi="Times New Roman" w:cs="Times New Roman"/>
+        </w:rPr>
+        <w:t>anagement</w:t>
+      </w:r>
+      <w:r>
+        <w:rPr>
+          <w:rFonts w:ascii="Times New Roman" w:hAnsi="Times New Roman" w:cs="Times New Roman"/>
+        </w:rPr>
+        <w:t xml:space="preserve"> is a framework used in cloud computing to control and manage Authentication</w:t>
+      </w:r>
+      <w:r>
+        <w:rPr>
+          <w:rFonts w:ascii="Times New Roman" w:hAnsi="Times New Roman" w:cs="Times New Roman"/>
+        </w:rPr>
+        <w:t xml:space="preserve"> (Who can access)</w:t>
+      </w:r>
+      <w:r>
+        <w:rPr>
+          <w:rFonts w:ascii="Times New Roman" w:hAnsi="Times New Roman" w:cs="Times New Roman"/>
+        </w:rPr>
+        <w:t xml:space="preserve"> &amp; Authorization </w:t>
+      </w:r>
+      <w:r>
+        <w:rPr>
+          <w:rFonts w:ascii="Times New Roman" w:hAnsi="Times New Roman" w:cs="Times New Roman"/>
+        </w:rPr>
+        <w:t xml:space="preserve">(What can be accessed) </w:t>
+      </w:r>
+      <w:r>
+        <w:rPr>
+          <w:rFonts w:ascii="Times New Roman" w:hAnsi="Times New Roman" w:cs="Times New Roman"/>
+        </w:rPr>
+        <w:t>of the users.</w:t>
+      </w:r>
+    </w:p>
+    <w:p>
+      <w:pPr>
+        <w:jc w:val="both"/>
+        <w:rPr>
+          <w:rFonts w:ascii="Times New Roman" w:hAnsi="Times New Roman" w:cs="Times New Roman"/>
+          <w:b/>
+          <w:bCs/>
+        </w:rPr>
+      </w:pPr>
+      <w:r>
+        <w:rPr>
+          <w:rFonts w:ascii="Times New Roman" w:hAnsi="Times New Roman" w:cs="Times New Roman"/>
+          <w:b/>
+          <w:bCs/>
+        </w:rPr>
+        <w:t>Components of IAM in cloud:</w:t>
+      </w:r>
+    </w:p>
+    <w:p>
+      <w:pPr>
+        <w:pStyle w:val="ListParagraph"/>
+        <w:numPr>
+          <w:ilvl w:val="1"/>
+          <w:numId w:val="16"/>
+        </w:numPr>
+        <w:jc w:val="both"/>
+        <w:rPr>
+          <w:rFonts w:ascii="Times New Roman" w:hAnsi="Times New Roman" w:cs="Times New Roman"/>
+        </w:rPr>
+      </w:pPr>
+      <w:r>
+        <w:rPr>
+          <w:rFonts w:ascii="Times New Roman" w:hAnsi="Times New Roman" w:cs="Times New Roman"/>
+        </w:rPr>
+        <w:t>Identities (Users, Groups, Roles)</w:t>
+      </w:r>
+    </w:p>
+    <w:p>
+      <w:pPr>
+        <w:pStyle w:val="ListParagraph"/>
+        <w:numPr>
+          <w:ilvl w:val="1"/>
+          <w:numId w:val="16"/>
+        </w:numPr>
+        <w:jc w:val="both"/>
+        <w:rPr>
+          <w:rFonts w:ascii="Times New Roman" w:hAnsi="Times New Roman" w:cs="Times New Roman"/>
+        </w:rPr>
+      </w:pPr>
+      <w:r>
+        <w:rPr>
+          <w:rFonts w:ascii="Times New Roman" w:hAnsi="Times New Roman" w:cs="Times New Roman"/>
+        </w:rPr>
+        <w:t>Authentication</w:t>
+      </w:r>
+      <w:r>
+        <w:rPr>
+          <w:rFonts w:ascii="Times New Roman" w:hAnsi="Times New Roman" w:cs="Times New Roman"/>
+        </w:rPr>
+        <w:t xml:space="preserve"> Methods (a. Username and Password, b. MFA (Multi-Factor Authentication), c. SSO (Single Sign ON), d. Federated Identity that uses third-party authentication)</w:t>
+      </w:r>
+    </w:p>
+    <w:p>
+      <w:pPr>
+        <w:pStyle w:val="ListParagraph"/>
+        <w:numPr>
+          <w:ilvl w:val="1"/>
+          <w:numId w:val="16"/>
+        </w:numPr>
+        <w:jc w:val="both"/>
+        <w:rPr>
+          <w:rFonts w:ascii="Times New Roman" w:hAnsi="Times New Roman" w:cs="Times New Roman"/>
+        </w:rPr>
+      </w:pPr>
+      <w:r>
+        <w:rPr>
+          <w:rFonts w:ascii="Times New Roman" w:hAnsi="Times New Roman" w:cs="Times New Roman"/>
+        </w:rPr>
+        <w:t>Authorization</w:t>
+      </w:r>
+      <w:r>
+        <w:rPr>
+          <w:rFonts w:ascii="Times New Roman" w:hAnsi="Times New Roman" w:cs="Times New Roman"/>
+        </w:rPr>
+        <w:t xml:space="preserve"> (a. Role-Based Access Control (RBAC), b</w:t>
+      </w:r>
+      <w:r>
+        <w:rPr>
+          <w:rFonts w:ascii="Times New Roman" w:hAnsi="Times New Roman" w:cs="Times New Roman"/>
+        </w:rPr>
+        <w:t xml:space="preserve">. </w:t>
+      </w:r>
+      <w:r>
+        <w:rPr>
+          <w:rFonts w:ascii="Times New Roman" w:hAnsi="Times New Roman" w:cs="Times New Roman"/>
+        </w:rPr>
+        <w:t>Attribute</w:t>
+      </w:r>
+      <w:r>
+        <w:rPr>
+          <w:rFonts w:ascii="Times New Roman" w:hAnsi="Times New Roman" w:cs="Times New Roman"/>
+        </w:rPr>
+        <w:t>-Based Access Control (</w:t>
+      </w:r>
+      <w:r>
+        <w:rPr>
+          <w:rFonts w:ascii="Times New Roman" w:hAnsi="Times New Roman" w:cs="Times New Roman"/>
+        </w:rPr>
+        <w:t>A</w:t>
+      </w:r>
+      <w:r>
+        <w:rPr>
+          <w:rFonts w:ascii="Times New Roman" w:hAnsi="Times New Roman" w:cs="Times New Roman"/>
+        </w:rPr>
+        <w:t>BAC)</w:t>
+      </w:r>
+      <w:r>
+        <w:rPr>
+          <w:rFonts w:ascii="Times New Roman" w:hAnsi="Times New Roman" w:cs="Times New Roman"/>
+        </w:rPr>
+        <w:t>, c</w:t>
+      </w:r>
+      <w:r>
+        <w:rPr>
+          <w:rFonts w:ascii="Times New Roman" w:hAnsi="Times New Roman" w:cs="Times New Roman"/>
+        </w:rPr>
+        <w:t xml:space="preserve">. </w:t>
+      </w:r>
+      <w:r>
+        <w:rPr>
+          <w:rFonts w:ascii="Times New Roman" w:hAnsi="Times New Roman" w:cs="Times New Roman"/>
+        </w:rPr>
+        <w:t>Policy</w:t>
+      </w:r>
+      <w:r>
+        <w:rPr>
+          <w:rFonts w:ascii="Times New Roman" w:hAnsi="Times New Roman" w:cs="Times New Roman"/>
+        </w:rPr>
+        <w:t>-Based Access Control (</w:t>
+      </w:r>
+      <w:r>
+        <w:rPr>
+          <w:rFonts w:ascii="Times New Roman" w:hAnsi="Times New Roman" w:cs="Times New Roman"/>
+        </w:rPr>
+        <w:t>P</w:t>
+      </w:r>
+      <w:r>
+        <w:rPr>
+          <w:rFonts w:ascii="Times New Roman" w:hAnsi="Times New Roman" w:cs="Times New Roman"/>
+        </w:rPr>
+        <w:t>BAC)</w:t>
+      </w:r>
+      <w:r>
+        <w:rPr>
+          <w:rFonts w:ascii="Times New Roman" w:hAnsi="Times New Roman" w:cs="Times New Roman"/>
+        </w:rPr>
+        <w:t>)</w:t>
+      </w:r>
+    </w:p>
+    <w:p>
+      <w:pPr>
+        <w:pStyle w:val="ListParagraph"/>
+        <w:numPr>
+          <w:ilvl w:val="1"/>
+          <w:numId w:val="16"/>
+        </w:numPr>
+        <w:jc w:val="both"/>
+        <w:rPr>
+          <w:rFonts w:ascii="Times New Roman" w:hAnsi="Times New Roman" w:cs="Times New Roman"/>
+        </w:rPr>
+      </w:pPr>
+      <w:r>
+        <w:rPr>
+          <w:rFonts w:ascii="Times New Roman" w:hAnsi="Times New Roman" w:cs="Times New Roman"/>
+        </w:rPr>
+        <w:t>IAM Policies and Permissions</w:t>
+      </w:r>
+    </w:p>
+    <w:p>
+      <w:pPr>
+        <w:pStyle w:val="ListParagraph"/>
+        <w:numPr>
+          <w:ilvl w:val="1"/>
+          <w:numId w:val="16"/>
+        </w:numPr>
+        <w:jc w:val="both"/>
+        <w:rPr>
+          <w:rFonts w:ascii="Times New Roman" w:hAnsi="Times New Roman" w:cs="Times New Roman"/>
+        </w:rPr>
+      </w:pPr>
+      <w:r>
+        <w:rPr>
+          <w:rFonts w:ascii="Times New Roman" w:hAnsi="Times New Roman" w:cs="Times New Roman"/>
+        </w:rPr>
+        <w:t>Audit, Logging and Monitoring</w:t>
       </w:r>
     </w:p>
     <w:sectPr>
@@ -2346,7 +3483,7 @@
   <w:abstractNum w:abstractNumId="1" w15:restartNumberingAfterBreak="0">
     <w:nsid w:val="01E56D08"/>
     <w:multiLevelType w:val="multilevel"/>
-    <w:tmpl w:val="2B5010E4"/>
+    <w:tmpl w:val="EAB4807E"/>
     <w:lvl w:ilvl="0">
       <w:start w:val="1"/>
       <w:numFmt w:val="bullet"/>
@@ -2363,20 +3500,16 @@
         <w:sz w:val="20"/>
       </w:rPr>
     </w:lvl>
-    <w:lvl w:ilvl="1" w:tentative="1">
-      <w:start w:val="1"/>
-      <w:numFmt w:val="bullet"/>
-      <w:lvlText w:val="o"/>
-      <w:lvlJc w:val="left"/>
-      <w:pPr>
-        <w:tabs>
-          <w:tab w:val="num" w:pos="1440"/>
-        </w:tabs>
+    <w:lvl w:ilvl="1">
+      <w:start w:val="1"/>
+      <w:numFmt w:val="decimal"/>
+      <w:lvlText w:val="%2."/>
+      <w:lvlJc w:val="left"/>
+      <w:pPr>
         <w:ind w:left="1440" w:hanging="360"/>
       </w:pPr>
       <w:rPr>
-        <w:rFonts w:ascii="Courier New" w:hAnsi="Courier New" w:hint="default"/>
-        <w:sz w:val="20"/>
+        <w:rFonts w:hint="default"/>
       </w:rPr>
     </w:lvl>
     <w:lvl w:ilvl="2" w:tentative="1">

</xml_diff>